<commit_message>
docs: rename deck to author filename, refresh Jobs-style script
- Rename docs/GreenCharge-Demo.pptx → docs/GreenCharge-Sharia Alam_25937881.pptx
  (so the file in the repo matches the deliverable's own title)
- Replace docs/GreenCharge-Script.docx with the Steve-Jobs-style rewrite
  (~3-minute runtime, short lines, strategic pauses)
- Update README to reference the new pptx filename
</commit_message>
<xml_diff>
--- a/docs/GreenCharge-Script.docx
+++ b/docs/GreenCharge-Script.docx
@@ -58,7 +58,7 @@
           <w:sz w:val="20"/>
           <w:szCs w:val="20"/>
         </w:rPr>
-        <w:t xml:space="preserve">Total runtime ≈ 4 minutes. Lines are written to be read aloud — adjust the wording to your own voice. A final ‘Demo Flow’ checklist is at the end of this doc — print it or keep it on a second screen during the demo.</w:t>
+        <w:t xml:space="preserve">Total runtime ≈ 3 minutes. Short lines. Strategic pauses. Read like Steve Jobs introducing a product — quiet confidence, one idea per beat. A final ‘Demo Flow’ checklist is at the end of this doc.</w:t>
       </w:r>
     </w:p>
     <w:p>
@@ -103,7 +103,7 @@
           <w:sz w:val="18"/>
           <w:szCs w:val="18"/>
         </w:rPr>
-        <w:t xml:space="preserve">OPENING (≈ 12 SECONDS)</w:t>
+        <w:t xml:space="preserve">OPENING (≈ 10 SECONDS)</w:t>
       </w:r>
     </w:p>
     <w:p>
@@ -135,7 +135,7 @@
           <w:sz w:val="20"/>
           <w:szCs w:val="20"/>
         </w:rPr>
-        <w:t xml:space="preserve">Green Charge wordmark · headline question · MMU hackathon line · team signature.</w:t>
+        <w:t xml:space="preserve">Green Charge wordmark · headline question · MMU hackathon line · author signature.</w:t>
       </w:r>
     </w:p>
     <w:p>
@@ -186,7 +186,99 @@
           <w:sz w:val="22"/>
           <w:szCs w:val="22"/>
         </w:rPr>
-        <w:t xml:space="preserve">Hi — we’re team Green Charge. We built a calculator that answers one specific question: what does it cost the planet to charge your phone, your laptop, your tablet — and when is it greener to plug in?</w:t>
+        <w:t xml:space="preserve">One question.</w:t>
+      </w:r>
+      <w:r>
+        <w:rPr>
+          <w:rFonts w:ascii="Calibri" w:cs="Calibri" w:eastAsia="Calibri" w:hAnsi="Calibri"/>
+          <w:b/>
+          <w:bCs/>
+          <w:color w:val="064E3B"/>
+          <w:sz w:val="26"/>
+          <w:szCs w:val="26"/>
+        </w:rPr>
+        <w:t xml:space="preserve">”</w:t>
+      </w:r>
+    </w:p>
+    <w:p>
+      <w:pPr>
+        <w:pBdr>
+          <w:left w:val="single" w:color="059669" w:sz="18" w:space="12"/>
+        </w:pBdr>
+        <w:spacing w:after="60" w:before="60" w:line="320"/>
+        <w:ind w:left="360"/>
+      </w:pPr>
+      <w:r>
+        <w:rPr>
+          <w:color w:val="1B2B1B"/>
+        </w:rPr>
+        <w:t xml:space="preserve">  </w:t>
+      </w:r>
+      <w:r>
+        <w:rPr>
+          <w:rFonts w:ascii="Calibri" w:cs="Calibri" w:eastAsia="Calibri" w:hAnsi="Calibri"/>
+          <w:b/>
+          <w:bCs/>
+          <w:color w:val="064E3B"/>
+          <w:sz w:val="26"/>
+          <w:szCs w:val="26"/>
+        </w:rPr>
+        <w:t xml:space="preserve">“</w:t>
+      </w:r>
+      <w:r>
+        <w:rPr>
+          <w:rFonts w:ascii="Calibri" w:cs="Calibri" w:eastAsia="Calibri" w:hAnsi="Calibri"/>
+          <w:color w:val="1B2B1B"/>
+          <w:sz w:val="22"/>
+          <w:szCs w:val="22"/>
+        </w:rPr>
+        <w:t xml:space="preserve">What does it cost the planet to charge your phone?</w:t>
+      </w:r>
+      <w:r>
+        <w:rPr>
+          <w:rFonts w:ascii="Calibri" w:cs="Calibri" w:eastAsia="Calibri" w:hAnsi="Calibri"/>
+          <w:b/>
+          <w:bCs/>
+          <w:color w:val="064E3B"/>
+          <w:sz w:val="26"/>
+          <w:szCs w:val="26"/>
+        </w:rPr>
+        <w:t xml:space="preserve">”</w:t>
+      </w:r>
+    </w:p>
+    <w:p>
+      <w:pPr>
+        <w:pBdr>
+          <w:left w:val="single" w:color="059669" w:sz="18" w:space="12"/>
+        </w:pBdr>
+        <w:spacing w:after="60" w:before="60" w:line="320"/>
+        <w:ind w:left="360"/>
+      </w:pPr>
+      <w:r>
+        <w:rPr>
+          <w:color w:val="1B2B1B"/>
+        </w:rPr>
+        <w:t xml:space="preserve">  </w:t>
+      </w:r>
+      <w:r>
+        <w:rPr>
+          <w:rFonts w:ascii="Calibri" w:cs="Calibri" w:eastAsia="Calibri" w:hAnsi="Calibri"/>
+          <w:b/>
+          <w:bCs/>
+          <w:color w:val="064E3B"/>
+          <w:sz w:val="26"/>
+          <w:szCs w:val="26"/>
+        </w:rPr>
+        <w:t xml:space="preserve">“</w:t>
+      </w:r>
+      <w:r>
+        <w:rPr>
+          <w:rFonts w:ascii="Calibri" w:cs="Calibri" w:eastAsia="Calibri" w:hAnsi="Calibri"/>
+          <w:color w:val="1B2B1B"/>
+          <w:sz w:val="22"/>
+          <w:szCs w:val="22"/>
+        </w:rPr>
+        <w:t xml:space="preserve">We built the tool that answers it.</w:t>
       </w:r>
       <w:r>
         <w:rPr>
@@ -232,7 +324,7 @@
           <w:sz w:val="22"/>
           <w:szCs w:val="22"/>
         </w:rPr>
-        <w:t xml:space="preserve">Hold for a beat before clicking off the title.</w:t>
+        <w:t xml:space="preserve">Beat after the question. Let it sit for half a second.</w:t>
       </w:r>
     </w:p>
     <w:p>
@@ -251,7 +343,7 @@
           <w:sz w:val="22"/>
           <w:szCs w:val="22"/>
         </w:rPr>
-        <w:t xml:space="preserve">Tone: warm, confident, low-key. The numbers will do the talking.</w:t>
+        <w:t xml:space="preserve">Tone: quiet confidence. Don’t sell. The numbers will sell.</w:t>
       </w:r>
     </w:p>
     <w:p>
@@ -296,7 +388,7 @@
           <w:sz w:val="18"/>
           <w:szCs w:val="18"/>
         </w:rPr>
-        <w:t xml:space="preserve">MOTIVATION (≈ 35 SECONDS)</w:t>
+        <w:t xml:space="preserve">MOTIVATION (≈ 25 SECONDS)</w:t>
       </w:r>
     </w:p>
     <w:p>
@@ -379,7 +471,7 @@
           <w:sz w:val="22"/>
           <w:szCs w:val="22"/>
         </w:rPr>
-        <w:t xml:space="preserve">Most carbon calculators talk about flights and burgers. Nobody talks about the everyday charge.</w:t>
+        <w:t xml:space="preserve">Carbon calculators talk about flights. Burgers. Cars.</w:t>
       </w:r>
       <w:r>
         <w:rPr>
@@ -425,7 +517,7 @@
           <w:sz w:val="22"/>
           <w:szCs w:val="22"/>
         </w:rPr>
-        <w:t xml:space="preserve">But three things made this the right problem to pick. One — we all do it, every day, multiple times. Two — UK grid carbon swings by five to ten times within a single day, depending on wind and solar and gas. Three — there’s no student-facing tool for this. Industry tools target enterprise — students charge ten devices and never see the cost.</w:t>
+        <w:t xml:space="preserve">Nobody talks about the everyday charge.</w:t>
       </w:r>
       <w:r>
         <w:rPr>
@@ -471,7 +563,191 @@
           <w:sz w:val="22"/>
           <w:szCs w:val="22"/>
         </w:rPr>
-        <w:t xml:space="preserve">So we built a calculator that answers one question — what does THIS charge cost, and when is it greener to plug in? The bet: behaviour change needs personal numbers, not a lecture.</w:t>
+        <w:t xml:space="preserve">Three things.</w:t>
+      </w:r>
+      <w:r>
+        <w:rPr>
+          <w:rFonts w:ascii="Calibri" w:cs="Calibri" w:eastAsia="Calibri" w:hAnsi="Calibri"/>
+          <w:b/>
+          <w:bCs/>
+          <w:color w:val="064E3B"/>
+          <w:sz w:val="26"/>
+          <w:szCs w:val="26"/>
+        </w:rPr>
+        <w:t xml:space="preserve">”</w:t>
+      </w:r>
+    </w:p>
+    <w:p>
+      <w:pPr>
+        <w:pBdr>
+          <w:left w:val="single" w:color="059669" w:sz="18" w:space="12"/>
+        </w:pBdr>
+        <w:spacing w:after="60" w:before="60" w:line="320"/>
+        <w:ind w:left="360"/>
+      </w:pPr>
+      <w:r>
+        <w:rPr>
+          <w:color w:val="1B2B1B"/>
+        </w:rPr>
+        <w:t xml:space="preserve">  </w:t>
+      </w:r>
+      <w:r>
+        <w:rPr>
+          <w:rFonts w:ascii="Calibri" w:cs="Calibri" w:eastAsia="Calibri" w:hAnsi="Calibri"/>
+          <w:b/>
+          <w:bCs/>
+          <w:color w:val="064E3B"/>
+          <w:sz w:val="26"/>
+          <w:szCs w:val="26"/>
+        </w:rPr>
+        <w:t xml:space="preserve">“</w:t>
+      </w:r>
+      <w:r>
+        <w:rPr>
+          <w:rFonts w:ascii="Calibri" w:cs="Calibri" w:eastAsia="Calibri" w:hAnsi="Calibri"/>
+          <w:color w:val="1B2B1B"/>
+          <w:sz w:val="22"/>
+          <w:szCs w:val="22"/>
+        </w:rPr>
+        <w:t xml:space="preserve">One — we all do it. Every day. Many times.</w:t>
+      </w:r>
+      <w:r>
+        <w:rPr>
+          <w:rFonts w:ascii="Calibri" w:cs="Calibri" w:eastAsia="Calibri" w:hAnsi="Calibri"/>
+          <w:b/>
+          <w:bCs/>
+          <w:color w:val="064E3B"/>
+          <w:sz w:val="26"/>
+          <w:szCs w:val="26"/>
+        </w:rPr>
+        <w:t xml:space="preserve">”</w:t>
+      </w:r>
+    </w:p>
+    <w:p>
+      <w:pPr>
+        <w:pBdr>
+          <w:left w:val="single" w:color="059669" w:sz="18" w:space="12"/>
+        </w:pBdr>
+        <w:spacing w:after="60" w:before="60" w:line="320"/>
+        <w:ind w:left="360"/>
+      </w:pPr>
+      <w:r>
+        <w:rPr>
+          <w:color w:val="1B2B1B"/>
+        </w:rPr>
+        <w:t xml:space="preserve">  </w:t>
+      </w:r>
+      <w:r>
+        <w:rPr>
+          <w:rFonts w:ascii="Calibri" w:cs="Calibri" w:eastAsia="Calibri" w:hAnsi="Calibri"/>
+          <w:b/>
+          <w:bCs/>
+          <w:color w:val="064E3B"/>
+          <w:sz w:val="26"/>
+          <w:szCs w:val="26"/>
+        </w:rPr>
+        <w:t xml:space="preserve">“</w:t>
+      </w:r>
+      <w:r>
+        <w:rPr>
+          <w:rFonts w:ascii="Calibri" w:cs="Calibri" w:eastAsia="Calibri" w:hAnsi="Calibri"/>
+          <w:color w:val="1B2B1B"/>
+          <w:sz w:val="22"/>
+          <w:szCs w:val="22"/>
+        </w:rPr>
+        <w:t xml:space="preserve">Two — grid carbon swings ten times in a single day.</w:t>
+      </w:r>
+      <w:r>
+        <w:rPr>
+          <w:rFonts w:ascii="Calibri" w:cs="Calibri" w:eastAsia="Calibri" w:hAnsi="Calibri"/>
+          <w:b/>
+          <w:bCs/>
+          <w:color w:val="064E3B"/>
+          <w:sz w:val="26"/>
+          <w:szCs w:val="26"/>
+        </w:rPr>
+        <w:t xml:space="preserve">”</w:t>
+      </w:r>
+    </w:p>
+    <w:p>
+      <w:pPr>
+        <w:pBdr>
+          <w:left w:val="single" w:color="059669" w:sz="18" w:space="12"/>
+        </w:pBdr>
+        <w:spacing w:after="60" w:before="60" w:line="320"/>
+        <w:ind w:left="360"/>
+      </w:pPr>
+      <w:r>
+        <w:rPr>
+          <w:color w:val="1B2B1B"/>
+        </w:rPr>
+        <w:t xml:space="preserve">  </w:t>
+      </w:r>
+      <w:r>
+        <w:rPr>
+          <w:rFonts w:ascii="Calibri" w:cs="Calibri" w:eastAsia="Calibri" w:hAnsi="Calibri"/>
+          <w:b/>
+          <w:bCs/>
+          <w:color w:val="064E3B"/>
+          <w:sz w:val="26"/>
+          <w:szCs w:val="26"/>
+        </w:rPr>
+        <w:t xml:space="preserve">“</w:t>
+      </w:r>
+      <w:r>
+        <w:rPr>
+          <w:rFonts w:ascii="Calibri" w:cs="Calibri" w:eastAsia="Calibri" w:hAnsi="Calibri"/>
+          <w:color w:val="1B2B1B"/>
+          <w:sz w:val="22"/>
+          <w:szCs w:val="22"/>
+        </w:rPr>
+        <w:t xml:space="preserve">Three — no tool for this. Not one.</w:t>
+      </w:r>
+      <w:r>
+        <w:rPr>
+          <w:rFonts w:ascii="Calibri" w:cs="Calibri" w:eastAsia="Calibri" w:hAnsi="Calibri"/>
+          <w:b/>
+          <w:bCs/>
+          <w:color w:val="064E3B"/>
+          <w:sz w:val="26"/>
+          <w:szCs w:val="26"/>
+        </w:rPr>
+        <w:t xml:space="preserve">”</w:t>
+      </w:r>
+    </w:p>
+    <w:p>
+      <w:pPr>
+        <w:pBdr>
+          <w:left w:val="single" w:color="059669" w:sz="18" w:space="12"/>
+        </w:pBdr>
+        <w:spacing w:after="60" w:before="60" w:line="320"/>
+        <w:ind w:left="360"/>
+      </w:pPr>
+      <w:r>
+        <w:rPr>
+          <w:color w:val="1B2B1B"/>
+        </w:rPr>
+        <w:t xml:space="preserve">  </w:t>
+      </w:r>
+      <w:r>
+        <w:rPr>
+          <w:rFonts w:ascii="Calibri" w:cs="Calibri" w:eastAsia="Calibri" w:hAnsi="Calibri"/>
+          <w:b/>
+          <w:bCs/>
+          <w:color w:val="064E3B"/>
+          <w:sz w:val="26"/>
+          <w:szCs w:val="26"/>
+        </w:rPr>
+        <w:t xml:space="preserve">“</w:t>
+      </w:r>
+      <w:r>
+        <w:rPr>
+          <w:rFonts w:ascii="Calibri" w:cs="Calibri" w:eastAsia="Calibri" w:hAnsi="Calibri"/>
+          <w:color w:val="1B2B1B"/>
+          <w:sz w:val="22"/>
+          <w:szCs w:val="22"/>
+        </w:rPr>
+        <w:t xml:space="preserve">So we built it.</w:t>
       </w:r>
       <w:r>
         <w:rPr>
@@ -517,7 +793,7 @@
           <w:sz w:val="22"/>
           <w:szCs w:val="22"/>
         </w:rPr>
-        <w:t xml:space="preserve">Land the three cards in order. Don’t race through them.</w:t>
+        <w:t xml:space="preserve">Land the three points like punches. Don’t blur them.</w:t>
       </w:r>
     </w:p>
     <w:p>
@@ -536,7 +812,7 @@
           <w:sz w:val="22"/>
           <w:szCs w:val="22"/>
         </w:rPr>
-        <w:t xml:space="preserve">Closing sentence is the bridge to the demo.</w:t>
+        <w:t xml:space="preserve">‘So we built it’ — the bridge to the demo. Walk to the screen.</w:t>
       </w:r>
     </w:p>
     <w:p>
@@ -581,7 +857,7 @@
           <w:sz w:val="18"/>
           <w:szCs w:val="18"/>
         </w:rPr>
-        <w:t xml:space="preserve">WHAT POWERS IT (≈ 25 SECONDS)</w:t>
+        <w:t xml:space="preserve">WHAT POWERS IT (≈ 15 SECONDS)</w:t>
       </w:r>
     </w:p>
     <w:p>
@@ -613,7 +889,7 @@
           <w:sz w:val="20"/>
           <w:szCs w:val="20"/>
         </w:rPr>
-        <w:t xml:space="preserve">48-hour chart on the left · ‘How it works’ explainer on the right.</w:t>
+        <w:t xml:space="preserve">48-hour chart · ‘How it works’ explainer.</w:t>
       </w:r>
     </w:p>
     <w:p>
@@ -664,7 +940,7 @@
           <w:sz w:val="22"/>
           <w:szCs w:val="22"/>
         </w:rPr>
-        <w:t xml:space="preserve">Behind it is live UK grid data — the National Grid ESO Carbon Intensity API. Free, public, half-hour resolution, 48 hours ahead.</w:t>
+        <w:t xml:space="preserve">Live UK grid data.</w:t>
       </w:r>
       <w:r>
         <w:rPr>
@@ -710,7 +986,7 @@
           <w:sz w:val="22"/>
           <w:szCs w:val="22"/>
         </w:rPr>
-        <w:t xml:space="preserve">You give us a postcode. We pull the carbon intensity forecast for your region and find the greenest window for whatever charge you’re about to do.</w:t>
+        <w:t xml:space="preserve">Forty-eight hours ahead. Half-hour resolution. By postcode.</w:t>
       </w:r>
       <w:r>
         <w:rPr>
@@ -756,7 +1032,53 @@
           <w:sz w:val="22"/>
           <w:szCs w:val="22"/>
         </w:rPr>
-        <w:t xml:space="preserve">The green band on this chart is that window — the cleanest few hours in the next forty-eight.</w:t>
+        <w:t xml:space="preserve">That green band on the chart?</w:t>
+      </w:r>
+      <w:r>
+        <w:rPr>
+          <w:rFonts w:ascii="Calibri" w:cs="Calibri" w:eastAsia="Calibri" w:hAnsi="Calibri"/>
+          <w:b/>
+          <w:bCs/>
+          <w:color w:val="064E3B"/>
+          <w:sz w:val="26"/>
+          <w:szCs w:val="26"/>
+        </w:rPr>
+        <w:t xml:space="preserve">”</w:t>
+      </w:r>
+    </w:p>
+    <w:p>
+      <w:pPr>
+        <w:pBdr>
+          <w:left w:val="single" w:color="059669" w:sz="18" w:space="12"/>
+        </w:pBdr>
+        <w:spacing w:after="60" w:before="60" w:line="320"/>
+        <w:ind w:left="360"/>
+      </w:pPr>
+      <w:r>
+        <w:rPr>
+          <w:color w:val="1B2B1B"/>
+        </w:rPr>
+        <w:t xml:space="preserve">  </w:t>
+      </w:r>
+      <w:r>
+        <w:rPr>
+          <w:rFonts w:ascii="Calibri" w:cs="Calibri" w:eastAsia="Calibri" w:hAnsi="Calibri"/>
+          <w:b/>
+          <w:bCs/>
+          <w:color w:val="064E3B"/>
+          <w:sz w:val="26"/>
+          <w:szCs w:val="26"/>
+        </w:rPr>
+        <w:t xml:space="preserve">“</w:t>
+      </w:r>
+      <w:r>
+        <w:rPr>
+          <w:rFonts w:ascii="Calibri" w:cs="Calibri" w:eastAsia="Calibri" w:hAnsi="Calibri"/>
+          <w:color w:val="1B2B1B"/>
+          <w:sz w:val="22"/>
+          <w:szCs w:val="22"/>
+        </w:rPr>
+        <w:t xml:space="preserve">That’s when to plug in.</w:t>
       </w:r>
       <w:r>
         <w:rPr>
@@ -802,7 +1124,7 @@
           <w:sz w:val="22"/>
           <w:szCs w:val="22"/>
         </w:rPr>
-        <w:t xml:space="preserve">Point to the green band specifically.</w:t>
+        <w:t xml:space="preserve">Point at the green band as you say the last line.</w:t>
       </w:r>
     </w:p>
     <w:p>
@@ -821,7 +1143,7 @@
           <w:sz w:val="22"/>
           <w:szCs w:val="22"/>
         </w:rPr>
-        <w:t xml:space="preserve">If they ask about accuracy: forecast vs actual is generally within ten gCO₂/kWh for the next six hours.</w:t>
+        <w:t xml:space="preserve">If asked about accuracy: forecast tracks actual within ~10 gCO₂/kWh for the next 6 hours.</w:t>
       </w:r>
     </w:p>
     <w:p>
@@ -849,7 +1171,7 @@
           <w:sz w:val="32"/>
           <w:szCs w:val="32"/>
         </w:rPr>
-        <w:t xml:space="preserve">Slide 4 — The headline feature — charge now or later</w:t>
+        <w:t xml:space="preserve">Slide 4 — The headline — charge now or later</w:t>
       </w:r>
     </w:p>
     <w:p>
@@ -866,7 +1188,7 @@
           <w:sz w:val="18"/>
           <w:szCs w:val="18"/>
         </w:rPr>
-        <w:t xml:space="preserve">THE HOOK (≈ 35 SECONDS)</w:t>
+        <w:t xml:space="preserve">THE HOOK (≈ 25 SECONDS)</w:t>
       </w:r>
     </w:p>
     <w:p>
@@ -898,7 +1220,7 @@
           <w:sz w:val="20"/>
           <w:szCs w:val="20"/>
         </w:rPr>
-        <w:t xml:space="preserve">Big hero card with the now-vs-later comparison · three stat callouts below.</w:t>
+        <w:t xml:space="preserve">Big hero gradient card · now-vs-later comparison · three stat callouts.</w:t>
       </w:r>
     </w:p>
     <w:p>
@@ -949,7 +1271,7 @@
           <w:sz w:val="22"/>
           <w:szCs w:val="22"/>
         </w:rPr>
-        <w:t xml:space="preserve">Here’s the thing that surprised even us. Same charge. Same battery. Same charger. The only thing we change is when you plug in.</w:t>
+        <w:t xml:space="preserve">Same charge. Same battery. Same charger.</w:t>
       </w:r>
       <w:r>
         <w:rPr>
@@ -995,7 +1317,7 @@
           <w:sz w:val="22"/>
           <w:szCs w:val="22"/>
         </w:rPr>
-        <w:t xml:space="preserve">Charging right now in Manchester, this iPhone produces around 1.1 grams of CO₂. If you charge in the greenest three-hour window tonight, it’s 230 milligrams. That’s an 83 percent saving on the same charge.</w:t>
+        <w:t xml:space="preserve">Charge now: one point one grams.</w:t>
       </w:r>
       <w:r>
         <w:rPr>
@@ -1041,7 +1363,99 @@
           <w:sz w:val="22"/>
           <w:szCs w:val="22"/>
         </w:rPr>
-        <w:t xml:space="preserve">Nothing fancy. No new hardware. Just timing.</w:t>
+        <w:t xml:space="preserve">Charge in the greenest window tonight: two hundred and thirty milligrams.</w:t>
+      </w:r>
+      <w:r>
+        <w:rPr>
+          <w:rFonts w:ascii="Calibri" w:cs="Calibri" w:eastAsia="Calibri" w:hAnsi="Calibri"/>
+          <w:b/>
+          <w:bCs/>
+          <w:color w:val="064E3B"/>
+          <w:sz w:val="26"/>
+          <w:szCs w:val="26"/>
+        </w:rPr>
+        <w:t xml:space="preserve">”</w:t>
+      </w:r>
+    </w:p>
+    <w:p>
+      <w:pPr>
+        <w:pBdr>
+          <w:left w:val="single" w:color="059669" w:sz="18" w:space="12"/>
+        </w:pBdr>
+        <w:spacing w:after="60" w:before="60" w:line="320"/>
+        <w:ind w:left="360"/>
+      </w:pPr>
+      <w:r>
+        <w:rPr>
+          <w:color w:val="1B2B1B"/>
+        </w:rPr>
+        <w:t xml:space="preserve">  </w:t>
+      </w:r>
+      <w:r>
+        <w:rPr>
+          <w:rFonts w:ascii="Calibri" w:cs="Calibri" w:eastAsia="Calibri" w:hAnsi="Calibri"/>
+          <w:b/>
+          <w:bCs/>
+          <w:color w:val="064E3B"/>
+          <w:sz w:val="26"/>
+          <w:szCs w:val="26"/>
+        </w:rPr>
+        <w:t xml:space="preserve">“</w:t>
+      </w:r>
+      <w:r>
+        <w:rPr>
+          <w:rFonts w:ascii="Calibri" w:cs="Calibri" w:eastAsia="Calibri" w:hAnsi="Calibri"/>
+          <w:color w:val="1B2B1B"/>
+          <w:sz w:val="22"/>
+          <w:szCs w:val="22"/>
+        </w:rPr>
+        <w:t xml:space="preserve">Eighty-three percent. For free.</w:t>
+      </w:r>
+      <w:r>
+        <w:rPr>
+          <w:rFonts w:ascii="Calibri" w:cs="Calibri" w:eastAsia="Calibri" w:hAnsi="Calibri"/>
+          <w:b/>
+          <w:bCs/>
+          <w:color w:val="064E3B"/>
+          <w:sz w:val="26"/>
+          <w:szCs w:val="26"/>
+        </w:rPr>
+        <w:t xml:space="preserve">”</w:t>
+      </w:r>
+    </w:p>
+    <w:p>
+      <w:pPr>
+        <w:pBdr>
+          <w:left w:val="single" w:color="059669" w:sz="18" w:space="12"/>
+        </w:pBdr>
+        <w:spacing w:after="60" w:before="60" w:line="320"/>
+        <w:ind w:left="360"/>
+      </w:pPr>
+      <w:r>
+        <w:rPr>
+          <w:color w:val="1B2B1B"/>
+        </w:rPr>
+        <w:t xml:space="preserve">  </w:t>
+      </w:r>
+      <w:r>
+        <w:rPr>
+          <w:rFonts w:ascii="Calibri" w:cs="Calibri" w:eastAsia="Calibri" w:hAnsi="Calibri"/>
+          <w:b/>
+          <w:bCs/>
+          <w:color w:val="064E3B"/>
+          <w:sz w:val="26"/>
+          <w:szCs w:val="26"/>
+        </w:rPr>
+        <w:t xml:space="preserve">“</w:t>
+      </w:r>
+      <w:r>
+        <w:rPr>
+          <w:rFonts w:ascii="Calibri" w:cs="Calibri" w:eastAsia="Calibri" w:hAnsi="Calibri"/>
+          <w:color w:val="1B2B1B"/>
+          <w:sz w:val="22"/>
+          <w:szCs w:val="22"/>
+        </w:rPr>
+        <w:t xml:space="preserve">Just the timing.</w:t>
       </w:r>
       <w:r>
         <w:rPr>
@@ -1087,7 +1501,7 @@
           <w:sz w:val="22"/>
           <w:szCs w:val="22"/>
         </w:rPr>
-        <w:t xml:space="preserve">Pause after “83 percent.” Let it land.</w:t>
+        <w:t xml:space="preserve">Pause after ‘eighty-three percent.’ Let the room breathe.</w:t>
       </w:r>
     </w:p>
     <w:p>
@@ -1106,7 +1520,7 @@
           <w:sz w:val="22"/>
           <w:szCs w:val="22"/>
         </w:rPr>
-        <w:t xml:space="preserve">If you’re demoing live, click into the activity dropdown and switch to ‘gaming’ to make the numbers jump.</w:t>
+        <w:t xml:space="preserve">If demoing live, slide the To% control during this beat — numbers move with you.</w:t>
       </w:r>
     </w:p>
     <w:p>
@@ -1151,7 +1565,7 @@
           <w:sz w:val="18"/>
           <w:szCs w:val="18"/>
         </w:rPr>
-        <w:t xml:space="preserve">THE UNIQUE ANGLE (≈ 30 SECONDS)</w:t>
+        <w:t xml:space="preserve">THE UNIQUE ANGLE (≈ 20 SECONDS)</w:t>
       </w:r>
     </w:p>
     <w:p>
@@ -1183,7 +1597,7 @@
           <w:sz w:val="20"/>
           <w:szCs w:val="20"/>
         </w:rPr>
-        <w:t xml:space="preserve">Bar chart of six activities while charging · ‘Why it matters’ side note.</w:t>
+        <w:t xml:space="preserve">Bar chart of six activities · ‘Why it matters’ side note.</w:t>
       </w:r>
     </w:p>
     <w:p>
@@ -1234,7 +1648,7 @@
           <w:sz w:val="22"/>
           <w:szCs w:val="22"/>
         </w:rPr>
-        <w:t xml:space="preserve">Most apps don’t model this — using a phone while it’s charging makes both sides waste more energy as heat. Gaming while charging adds about twenty-five percent. AI chat while charging adds about eighteen.</w:t>
+        <w:t xml:space="preserve">Here’s something nobody models.</w:t>
       </w:r>
       <w:r>
         <w:rPr>
@@ -1280,7 +1694,99 @@
           <w:sz w:val="22"/>
           <w:szCs w:val="22"/>
         </w:rPr>
-        <w:t xml:space="preserve">So the simplest behaviour change isn’t buying a new device. It’s charging first and scrolling later.</w:t>
+        <w:t xml:space="preserve">Using your phone while it charges?</w:t>
+      </w:r>
+      <w:r>
+        <w:rPr>
+          <w:rFonts w:ascii="Calibri" w:cs="Calibri" w:eastAsia="Calibri" w:hAnsi="Calibri"/>
+          <w:b/>
+          <w:bCs/>
+          <w:color w:val="064E3B"/>
+          <w:sz w:val="26"/>
+          <w:szCs w:val="26"/>
+        </w:rPr>
+        <w:t xml:space="preserve">”</w:t>
+      </w:r>
+    </w:p>
+    <w:p>
+      <w:pPr>
+        <w:pBdr>
+          <w:left w:val="single" w:color="059669" w:sz="18" w:space="12"/>
+        </w:pBdr>
+        <w:spacing w:after="60" w:before="60" w:line="320"/>
+        <w:ind w:left="360"/>
+      </w:pPr>
+      <w:r>
+        <w:rPr>
+          <w:color w:val="1B2B1B"/>
+        </w:rPr>
+        <w:t xml:space="preserve">  </w:t>
+      </w:r>
+      <w:r>
+        <w:rPr>
+          <w:rFonts w:ascii="Calibri" w:cs="Calibri" w:eastAsia="Calibri" w:hAnsi="Calibri"/>
+          <w:b/>
+          <w:bCs/>
+          <w:color w:val="064E3B"/>
+          <w:sz w:val="26"/>
+          <w:szCs w:val="26"/>
+        </w:rPr>
+        <w:t xml:space="preserve">“</w:t>
+      </w:r>
+      <w:r>
+        <w:rPr>
+          <w:rFonts w:ascii="Calibri" w:cs="Calibri" w:eastAsia="Calibri" w:hAnsi="Calibri"/>
+          <w:color w:val="1B2B1B"/>
+          <w:sz w:val="22"/>
+          <w:szCs w:val="22"/>
+        </w:rPr>
+        <w:t xml:space="preserve">Twenty-five percent more energy. As heat.</w:t>
+      </w:r>
+      <w:r>
+        <w:rPr>
+          <w:rFonts w:ascii="Calibri" w:cs="Calibri" w:eastAsia="Calibri" w:hAnsi="Calibri"/>
+          <w:b/>
+          <w:bCs/>
+          <w:color w:val="064E3B"/>
+          <w:sz w:val="26"/>
+          <w:szCs w:val="26"/>
+        </w:rPr>
+        <w:t xml:space="preserve">”</w:t>
+      </w:r>
+    </w:p>
+    <w:p>
+      <w:pPr>
+        <w:pBdr>
+          <w:left w:val="single" w:color="059669" w:sz="18" w:space="12"/>
+        </w:pBdr>
+        <w:spacing w:after="60" w:before="60" w:line="320"/>
+        <w:ind w:left="360"/>
+      </w:pPr>
+      <w:r>
+        <w:rPr>
+          <w:color w:val="1B2B1B"/>
+        </w:rPr>
+        <w:t xml:space="preserve">  </w:t>
+      </w:r>
+      <w:r>
+        <w:rPr>
+          <w:rFonts w:ascii="Calibri" w:cs="Calibri" w:eastAsia="Calibri" w:hAnsi="Calibri"/>
+          <w:b/>
+          <w:bCs/>
+          <w:color w:val="064E3B"/>
+          <w:sz w:val="26"/>
+          <w:szCs w:val="26"/>
+        </w:rPr>
+        <w:t xml:space="preserve">“</w:t>
+      </w:r>
+      <w:r>
+        <w:rPr>
+          <w:rFonts w:ascii="Calibri" w:cs="Calibri" w:eastAsia="Calibri" w:hAnsi="Calibri"/>
+          <w:color w:val="1B2B1B"/>
+          <w:sz w:val="22"/>
+          <w:szCs w:val="22"/>
+        </w:rPr>
+        <w:t xml:space="preserve">Charge first. Scroll later.</w:t>
       </w:r>
       <w:r>
         <w:rPr>
@@ -1326,7 +1832,7 @@
           <w:sz w:val="22"/>
           <w:szCs w:val="22"/>
         </w:rPr>
-        <w:t xml:space="preserve">The bar chart is the highlight. The selected activity is the green bar.</w:t>
+        <w:t xml:space="preserve">Switch Activity to ‘Gaming’ live — the bar jumps to green, the KPI flips to +25%.</w:t>
       </w:r>
     </w:p>
     <w:p>
@@ -1345,7 +1851,7 @@
           <w:sz w:val="22"/>
           <w:szCs w:val="22"/>
         </w:rPr>
-        <w:t xml:space="preserve">If asked why heat matters: lithium charging efficiency drops when the cell heats up — both the battery and the chipset waste more electricity as heat.</w:t>
+        <w:t xml:space="preserve">Then put it back to ‘Off / locked’ before slide 6.</w:t>
       </w:r>
     </w:p>
     <w:p>
@@ -1373,7 +1879,7 @@
           <w:sz w:val="32"/>
           <w:szCs w:val="32"/>
         </w:rPr>
-        <w:t xml:space="preserve">Slide 6 — Same task. Different device. Different AI kind.</w:t>
+        <w:t xml:space="preserve">Slide 6 — Same task. Different device. Different AI.</w:t>
       </w:r>
     </w:p>
     <w:p>
@@ -1390,7 +1896,7 @@
           <w:sz w:val="18"/>
           <w:szCs w:val="18"/>
         </w:rPr>
-        <w:t xml:space="preserve">THE QUESTION OUR FACULTY ASKED (≈ 40 SECONDS)</w:t>
+        <w:t xml:space="preserve">TWO LEVERS (≈ 30 SECONDS)</w:t>
       </w:r>
     </w:p>
     <w:p>
@@ -1422,7 +1928,7 @@
           <w:sz w:val="20"/>
           <w:szCs w:val="20"/>
         </w:rPr>
-        <w:t xml:space="preserve">Three controls (Task · AI kind · Duration) · 3 device cards (phone / tablet / laptop) · ‘Two levers’ side note.</w:t>
+        <w:t xml:space="preserve">Three controls (Task · AI kind · Duration) · 3 device cards · ‘Two levers’ side note.</w:t>
       </w:r>
     </w:p>
     <w:p>
@@ -1473,7 +1979,7 @@
           <w:sz w:val="22"/>
           <w:szCs w:val="22"/>
         </w:rPr>
-        <w:t xml:space="preserve">Our faculty asked a brilliant question — what if you do the same AI task on a phone versus a MacBook? Same answer. Same datacenter. Same prompt.</w:t>
+        <w:t xml:space="preserve">Our faculty asked one question.</w:t>
       </w:r>
       <w:r>
         <w:rPr>
@@ -1519,7 +2025,7 @@
           <w:sz w:val="22"/>
           <w:szCs w:val="22"/>
         </w:rPr>
-        <w:t xml:space="preserve">The cloud cost is identical. But on your desk, the laptop uses four-and-a-half times more local energy than the phone, for the same task. Use your phone for AI chat.</w:t>
+        <w:t xml:space="preserve">Same AI task. Phone or MacBook?</w:t>
       </w:r>
       <w:r>
         <w:rPr>
@@ -1565,7 +2071,7 @@
           <w:sz w:val="22"/>
           <w:szCs w:val="22"/>
         </w:rPr>
-        <w:t xml:space="preserve">But there’s a second lever — the kind of AI you’re running. A chat reply is about one gram of CO₂ per output. Long-context coding is twelve. An image generation, three. A video generation, ninety.</w:t>
+        <w:t xml:space="preserve">The cloud doesn’t care. Same answer.</w:t>
       </w:r>
       <w:r>
         <w:rPr>
@@ -1611,7 +2117,237 @@
           <w:sz w:val="22"/>
           <w:szCs w:val="22"/>
         </w:rPr>
-        <w:t xml:space="preserve">So two questions every time: which device, and which kind of AI. Watch how the numbers move when I switch from chat to video gen.</w:t>
+        <w:t xml:space="preserve">But your laptop? Four-and-a-half times more energy. Locally.</w:t>
+      </w:r>
+      <w:r>
+        <w:rPr>
+          <w:rFonts w:ascii="Calibri" w:cs="Calibri" w:eastAsia="Calibri" w:hAnsi="Calibri"/>
+          <w:b/>
+          <w:bCs/>
+          <w:color w:val="064E3B"/>
+          <w:sz w:val="26"/>
+          <w:szCs w:val="26"/>
+        </w:rPr>
+        <w:t xml:space="preserve">”</w:t>
+      </w:r>
+    </w:p>
+    <w:p>
+      <w:pPr>
+        <w:pBdr>
+          <w:left w:val="single" w:color="059669" w:sz="18" w:space="12"/>
+        </w:pBdr>
+        <w:spacing w:after="60" w:before="60" w:line="320"/>
+        <w:ind w:left="360"/>
+      </w:pPr>
+      <w:r>
+        <w:rPr>
+          <w:color w:val="1B2B1B"/>
+        </w:rPr>
+        <w:t xml:space="preserve">  </w:t>
+      </w:r>
+      <w:r>
+        <w:rPr>
+          <w:rFonts w:ascii="Calibri" w:cs="Calibri" w:eastAsia="Calibri" w:hAnsi="Calibri"/>
+          <w:b/>
+          <w:bCs/>
+          <w:color w:val="064E3B"/>
+          <w:sz w:val="26"/>
+          <w:szCs w:val="26"/>
+        </w:rPr>
+        <w:t xml:space="preserve">“</w:t>
+      </w:r>
+      <w:r>
+        <w:rPr>
+          <w:rFonts w:ascii="Calibri" w:cs="Calibri" w:eastAsia="Calibri" w:hAnsi="Calibri"/>
+          <w:color w:val="1B2B1B"/>
+          <w:sz w:val="22"/>
+          <w:szCs w:val="22"/>
+        </w:rPr>
+        <w:t xml:space="preserve">Two levers.</w:t>
+      </w:r>
+      <w:r>
+        <w:rPr>
+          <w:rFonts w:ascii="Calibri" w:cs="Calibri" w:eastAsia="Calibri" w:hAnsi="Calibri"/>
+          <w:b/>
+          <w:bCs/>
+          <w:color w:val="064E3B"/>
+          <w:sz w:val="26"/>
+          <w:szCs w:val="26"/>
+        </w:rPr>
+        <w:t xml:space="preserve">”</w:t>
+      </w:r>
+    </w:p>
+    <w:p>
+      <w:pPr>
+        <w:pBdr>
+          <w:left w:val="single" w:color="059669" w:sz="18" w:space="12"/>
+        </w:pBdr>
+        <w:spacing w:after="60" w:before="60" w:line="320"/>
+        <w:ind w:left="360"/>
+      </w:pPr>
+      <w:r>
+        <w:rPr>
+          <w:color w:val="1B2B1B"/>
+        </w:rPr>
+        <w:t xml:space="preserve">  </w:t>
+      </w:r>
+      <w:r>
+        <w:rPr>
+          <w:rFonts w:ascii="Calibri" w:cs="Calibri" w:eastAsia="Calibri" w:hAnsi="Calibri"/>
+          <w:b/>
+          <w:bCs/>
+          <w:color w:val="064E3B"/>
+          <w:sz w:val="26"/>
+          <w:szCs w:val="26"/>
+        </w:rPr>
+        <w:t xml:space="preserve">“</w:t>
+      </w:r>
+      <w:r>
+        <w:rPr>
+          <w:rFonts w:ascii="Calibri" w:cs="Calibri" w:eastAsia="Calibri" w:hAnsi="Calibri"/>
+          <w:color w:val="1B2B1B"/>
+          <w:sz w:val="22"/>
+          <w:szCs w:val="22"/>
+        </w:rPr>
+        <w:t xml:space="preserve">Which device.</w:t>
+      </w:r>
+      <w:r>
+        <w:rPr>
+          <w:rFonts w:ascii="Calibri" w:cs="Calibri" w:eastAsia="Calibri" w:hAnsi="Calibri"/>
+          <w:b/>
+          <w:bCs/>
+          <w:color w:val="064E3B"/>
+          <w:sz w:val="26"/>
+          <w:szCs w:val="26"/>
+        </w:rPr>
+        <w:t xml:space="preserve">”</w:t>
+      </w:r>
+    </w:p>
+    <w:p>
+      <w:pPr>
+        <w:pBdr>
+          <w:left w:val="single" w:color="059669" w:sz="18" w:space="12"/>
+        </w:pBdr>
+        <w:spacing w:after="60" w:before="60" w:line="320"/>
+        <w:ind w:left="360"/>
+      </w:pPr>
+      <w:r>
+        <w:rPr>
+          <w:color w:val="1B2B1B"/>
+        </w:rPr>
+        <w:t xml:space="preserve">  </w:t>
+      </w:r>
+      <w:r>
+        <w:rPr>
+          <w:rFonts w:ascii="Calibri" w:cs="Calibri" w:eastAsia="Calibri" w:hAnsi="Calibri"/>
+          <w:b/>
+          <w:bCs/>
+          <w:color w:val="064E3B"/>
+          <w:sz w:val="26"/>
+          <w:szCs w:val="26"/>
+        </w:rPr>
+        <w:t xml:space="preserve">“</w:t>
+      </w:r>
+      <w:r>
+        <w:rPr>
+          <w:rFonts w:ascii="Calibri" w:cs="Calibri" w:eastAsia="Calibri" w:hAnsi="Calibri"/>
+          <w:color w:val="1B2B1B"/>
+          <w:sz w:val="22"/>
+          <w:szCs w:val="22"/>
+        </w:rPr>
+        <w:t xml:space="preserve">And which kind of AI.</w:t>
+      </w:r>
+      <w:r>
+        <w:rPr>
+          <w:rFonts w:ascii="Calibri" w:cs="Calibri" w:eastAsia="Calibri" w:hAnsi="Calibri"/>
+          <w:b/>
+          <w:bCs/>
+          <w:color w:val="064E3B"/>
+          <w:sz w:val="26"/>
+          <w:szCs w:val="26"/>
+        </w:rPr>
+        <w:t xml:space="preserve">”</w:t>
+      </w:r>
+    </w:p>
+    <w:p>
+      <w:pPr>
+        <w:pBdr>
+          <w:left w:val="single" w:color="059669" w:sz="18" w:space="12"/>
+        </w:pBdr>
+        <w:spacing w:after="60" w:before="60" w:line="320"/>
+        <w:ind w:left="360"/>
+      </w:pPr>
+      <w:r>
+        <w:rPr>
+          <w:color w:val="1B2B1B"/>
+        </w:rPr>
+        <w:t xml:space="preserve">  </w:t>
+      </w:r>
+      <w:r>
+        <w:rPr>
+          <w:rFonts w:ascii="Calibri" w:cs="Calibri" w:eastAsia="Calibri" w:hAnsi="Calibri"/>
+          <w:b/>
+          <w:bCs/>
+          <w:color w:val="064E3B"/>
+          <w:sz w:val="26"/>
+          <w:szCs w:val="26"/>
+        </w:rPr>
+        <w:t xml:space="preserve">“</w:t>
+      </w:r>
+      <w:r>
+        <w:rPr>
+          <w:rFonts w:ascii="Calibri" w:cs="Calibri" w:eastAsia="Calibri" w:hAnsi="Calibri"/>
+          <w:color w:val="1B2B1B"/>
+          <w:sz w:val="22"/>
+          <w:szCs w:val="22"/>
+        </w:rPr>
+        <w:t xml:space="preserve">Chat reply: one gram. Video generation: ninety.</w:t>
+      </w:r>
+      <w:r>
+        <w:rPr>
+          <w:rFonts w:ascii="Calibri" w:cs="Calibri" w:eastAsia="Calibri" w:hAnsi="Calibri"/>
+          <w:b/>
+          <w:bCs/>
+          <w:color w:val="064E3B"/>
+          <w:sz w:val="26"/>
+          <w:szCs w:val="26"/>
+        </w:rPr>
+        <w:t xml:space="preserve">”</w:t>
+      </w:r>
+    </w:p>
+    <w:p>
+      <w:pPr>
+        <w:pBdr>
+          <w:left w:val="single" w:color="059669" w:sz="18" w:space="12"/>
+        </w:pBdr>
+        <w:spacing w:after="60" w:before="60" w:line="320"/>
+        <w:ind w:left="360"/>
+      </w:pPr>
+      <w:r>
+        <w:rPr>
+          <w:color w:val="1B2B1B"/>
+        </w:rPr>
+        <w:t xml:space="preserve">  </w:t>
+      </w:r>
+      <w:r>
+        <w:rPr>
+          <w:rFonts w:ascii="Calibri" w:cs="Calibri" w:eastAsia="Calibri" w:hAnsi="Calibri"/>
+          <w:b/>
+          <w:bCs/>
+          <w:color w:val="064E3B"/>
+          <w:sz w:val="26"/>
+          <w:szCs w:val="26"/>
+        </w:rPr>
+        <w:t xml:space="preserve">“</w:t>
+      </w:r>
+      <w:r>
+        <w:rPr>
+          <w:rFonts w:ascii="Calibri" w:cs="Calibri" w:eastAsia="Calibri" w:hAnsi="Calibri"/>
+          <w:color w:val="1B2B1B"/>
+          <w:sz w:val="22"/>
+          <w:szCs w:val="22"/>
+        </w:rPr>
+        <w:t xml:space="preserve">Watch.</w:t>
       </w:r>
       <w:r>
         <w:rPr>
@@ -1657,7 +2393,7 @@
           <w:sz w:val="22"/>
           <w:szCs w:val="22"/>
         </w:rPr>
-        <w:t xml:space="preserve">If you can, switch the AI-kind picker live: short text → image → video, to show the server share jumping.</w:t>
+        <w:t xml:space="preserve">After ‘Watch.’ — switch the AI-kind picker: Short prompt → Image gen → Video gen. Numbers jump live.</w:t>
       </w:r>
     </w:p>
     <w:p>
@@ -1676,7 +2412,392 @@
           <w:sz w:val="22"/>
           <w:szCs w:val="22"/>
         </w:rPr>
-        <w:t xml:space="preserve">Then switch task to video-call or gaming to show the device dominating.</w:t>
+        <w:t xml:space="preserve">Then switch Task to Video call to show device dominating again.</w:t>
+      </w:r>
+    </w:p>
+    <w:p>
+      <w:pPr>
+        <w:pBdr>
+          <w:bottom w:val="single" w:color="E5E7EB" w:sz="8" w:space="1"/>
+        </w:pBdr>
+        <w:spacing w:after="240" w:before="240"/>
+      </w:pPr>
+      <w:r>
+        <w:t xml:space="preserve"/>
+      </w:r>
+    </w:p>
+    <w:p>
+      <w:pPr>
+        <w:pStyle w:val="Heading1"/>
+        <w:spacing w:after="200" w:before="300"/>
+      </w:pPr>
+      <w:r>
+        <w:rPr>
+          <w:rFonts w:ascii="Calibri" w:cs="Calibri" w:eastAsia="Calibri" w:hAnsi="Calibri"/>
+          <w:b/>
+          <w:bCs/>
+          <w:color w:val="064E3B"/>
+          <w:sz w:val="32"/>
+          <w:szCs w:val="32"/>
+        </w:rPr>
+        <w:t xml:space="preserve">Slide 7 — Guesstimate of positive impact</w:t>
+      </w:r>
+    </w:p>
+    <w:p>
+      <w:pPr>
+        <w:spacing w:after="60" w:before="120"/>
+      </w:pPr>
+      <w:r>
+        <w:rPr>
+          <w:rFonts w:ascii="Calibri" w:cs="Calibri" w:eastAsia="Calibri" w:hAnsi="Calibri"/>
+          <w:b/>
+          <w:bCs/>
+          <w:color w:val="059669"/>
+          <w:spacing w:val="60"/>
+          <w:sz w:val="18"/>
+          <w:szCs w:val="18"/>
+        </w:rPr>
+        <w:t xml:space="preserve">THE LADDER (≈ 25 SECONDS)</w:t>
+      </w:r>
+    </w:p>
+    <w:p>
+      <w:pPr>
+        <w:spacing w:after="80" w:before="160"/>
+      </w:pPr>
+      <w:r>
+        <w:rPr>
+          <w:rFonts w:ascii="Calibri" w:cs="Calibri" w:eastAsia="Calibri" w:hAnsi="Calibri"/>
+          <w:b/>
+          <w:bCs/>
+          <w:color w:val="1B2B1B"/>
+          <w:sz w:val="22"/>
+          <w:szCs w:val="22"/>
+        </w:rPr>
+        <w:t xml:space="preserve">On screen</w:t>
+      </w:r>
+    </w:p>
+    <w:p>
+      <w:pPr>
+        <w:spacing w:after="60" w:before="60"/>
+      </w:pPr>
+      <w:r>
+        <w:rPr>
+          <w:rFonts w:ascii="Calibri" w:cs="Calibri" w:eastAsia="Calibri" w:hAnsi="Calibri"/>
+          <w:i/>
+          <w:iCs/>
+          <w:color w:val="475569"/>
+          <w:sz w:val="20"/>
+          <w:szCs w:val="20"/>
+        </w:rPr>
+        <w:t xml:space="preserve">Dark forest background · 3 rungs (1 student → 25k MMU → 1.5M UK uni students).</w:t>
+      </w:r>
+    </w:p>
+    <w:p>
+      <w:pPr>
+        <w:spacing w:after="80" w:before="160"/>
+      </w:pPr>
+      <w:r>
+        <w:rPr>
+          <w:rFonts w:ascii="Calibri" w:cs="Calibri" w:eastAsia="Calibri" w:hAnsi="Calibri"/>
+          <w:b/>
+          <w:bCs/>
+          <w:color w:val="1B2B1B"/>
+          <w:sz w:val="22"/>
+          <w:szCs w:val="22"/>
+        </w:rPr>
+        <w:t xml:space="preserve">Say</w:t>
+      </w:r>
+    </w:p>
+    <w:p>
+      <w:pPr>
+        <w:pBdr>
+          <w:left w:val="single" w:color="059669" w:sz="18" w:space="12"/>
+        </w:pBdr>
+        <w:spacing w:after="60" w:before="60" w:line="320"/>
+        <w:ind w:left="360"/>
+      </w:pPr>
+      <w:r>
+        <w:rPr>
+          <w:color w:val="1B2B1B"/>
+        </w:rPr>
+        <w:t xml:space="preserve">  </w:t>
+      </w:r>
+      <w:r>
+        <w:rPr>
+          <w:rFonts w:ascii="Calibri" w:cs="Calibri" w:eastAsia="Calibri" w:hAnsi="Calibri"/>
+          <w:b/>
+          <w:bCs/>
+          <w:color w:val="064E3B"/>
+          <w:sz w:val="26"/>
+          <w:szCs w:val="26"/>
+        </w:rPr>
+        <w:t xml:space="preserve">“</w:t>
+      </w:r>
+      <w:r>
+        <w:rPr>
+          <w:rFonts w:ascii="Calibri" w:cs="Calibri" w:eastAsia="Calibri" w:hAnsi="Calibri"/>
+          <w:color w:val="1B2B1B"/>
+          <w:sz w:val="22"/>
+          <w:szCs w:val="22"/>
+        </w:rPr>
+        <w:t xml:space="preserve">One student, one year? Quarter of a kilo.</w:t>
+      </w:r>
+      <w:r>
+        <w:rPr>
+          <w:rFonts w:ascii="Calibri" w:cs="Calibri" w:eastAsia="Calibri" w:hAnsi="Calibri"/>
+          <w:b/>
+          <w:bCs/>
+          <w:color w:val="064E3B"/>
+          <w:sz w:val="26"/>
+          <w:szCs w:val="26"/>
+        </w:rPr>
+        <w:t xml:space="preserve">”</w:t>
+      </w:r>
+    </w:p>
+    <w:p>
+      <w:pPr>
+        <w:pBdr>
+          <w:left w:val="single" w:color="059669" w:sz="18" w:space="12"/>
+        </w:pBdr>
+        <w:spacing w:after="60" w:before="60" w:line="320"/>
+        <w:ind w:left="360"/>
+      </w:pPr>
+      <w:r>
+        <w:rPr>
+          <w:color w:val="1B2B1B"/>
+        </w:rPr>
+        <w:t xml:space="preserve">  </w:t>
+      </w:r>
+      <w:r>
+        <w:rPr>
+          <w:rFonts w:ascii="Calibri" w:cs="Calibri" w:eastAsia="Calibri" w:hAnsi="Calibri"/>
+          <w:b/>
+          <w:bCs/>
+          <w:color w:val="064E3B"/>
+          <w:sz w:val="26"/>
+          <w:szCs w:val="26"/>
+        </w:rPr>
+        <w:t xml:space="preserve">“</w:t>
+      </w:r>
+      <w:r>
+        <w:rPr>
+          <w:rFonts w:ascii="Calibri" w:cs="Calibri" w:eastAsia="Calibri" w:hAnsi="Calibri"/>
+          <w:color w:val="1B2B1B"/>
+          <w:sz w:val="22"/>
+          <w:szCs w:val="22"/>
+        </w:rPr>
+        <w:t xml:space="preserve">Tiny.</w:t>
+      </w:r>
+      <w:r>
+        <w:rPr>
+          <w:rFonts w:ascii="Calibri" w:cs="Calibri" w:eastAsia="Calibri" w:hAnsi="Calibri"/>
+          <w:b/>
+          <w:bCs/>
+          <w:color w:val="064E3B"/>
+          <w:sz w:val="26"/>
+          <w:szCs w:val="26"/>
+        </w:rPr>
+        <w:t xml:space="preserve">”</w:t>
+      </w:r>
+    </w:p>
+    <w:p>
+      <w:pPr>
+        <w:pBdr>
+          <w:left w:val="single" w:color="059669" w:sz="18" w:space="12"/>
+        </w:pBdr>
+        <w:spacing w:after="60" w:before="60" w:line="320"/>
+        <w:ind w:left="360"/>
+      </w:pPr>
+      <w:r>
+        <w:rPr>
+          <w:color w:val="1B2B1B"/>
+        </w:rPr>
+        <w:t xml:space="preserve">  </w:t>
+      </w:r>
+      <w:r>
+        <w:rPr>
+          <w:rFonts w:ascii="Calibri" w:cs="Calibri" w:eastAsia="Calibri" w:hAnsi="Calibri"/>
+          <w:b/>
+          <w:bCs/>
+          <w:color w:val="064E3B"/>
+          <w:sz w:val="26"/>
+          <w:szCs w:val="26"/>
+        </w:rPr>
+        <w:t xml:space="preserve">“</w:t>
+      </w:r>
+      <w:r>
+        <w:rPr>
+          <w:rFonts w:ascii="Calibri" w:cs="Calibri" w:eastAsia="Calibri" w:hAnsi="Calibri"/>
+          <w:color w:val="1B2B1B"/>
+          <w:sz w:val="22"/>
+          <w:szCs w:val="22"/>
+        </w:rPr>
+        <w:t xml:space="preserve">Twenty-five thousand MMU students?</w:t>
+      </w:r>
+      <w:r>
+        <w:rPr>
+          <w:rFonts w:ascii="Calibri" w:cs="Calibri" w:eastAsia="Calibri" w:hAnsi="Calibri"/>
+          <w:b/>
+          <w:bCs/>
+          <w:color w:val="064E3B"/>
+          <w:sz w:val="26"/>
+          <w:szCs w:val="26"/>
+        </w:rPr>
+        <w:t xml:space="preserve">”</w:t>
+      </w:r>
+    </w:p>
+    <w:p>
+      <w:pPr>
+        <w:pBdr>
+          <w:left w:val="single" w:color="059669" w:sz="18" w:space="12"/>
+        </w:pBdr>
+        <w:spacing w:after="60" w:before="60" w:line="320"/>
+        <w:ind w:left="360"/>
+      </w:pPr>
+      <w:r>
+        <w:rPr>
+          <w:color w:val="1B2B1B"/>
+        </w:rPr>
+        <w:t xml:space="preserve">  </w:t>
+      </w:r>
+      <w:r>
+        <w:rPr>
+          <w:rFonts w:ascii="Calibri" w:cs="Calibri" w:eastAsia="Calibri" w:hAnsi="Calibri"/>
+          <w:b/>
+          <w:bCs/>
+          <w:color w:val="064E3B"/>
+          <w:sz w:val="26"/>
+          <w:szCs w:val="26"/>
+        </w:rPr>
+        <w:t xml:space="preserve">“</w:t>
+      </w:r>
+      <w:r>
+        <w:rPr>
+          <w:rFonts w:ascii="Calibri" w:cs="Calibri" w:eastAsia="Calibri" w:hAnsi="Calibri"/>
+          <w:color w:val="1B2B1B"/>
+          <w:sz w:val="22"/>
+          <w:szCs w:val="22"/>
+        </w:rPr>
+        <w:t xml:space="preserve">Four to eight tonnes. Every year.</w:t>
+      </w:r>
+      <w:r>
+        <w:rPr>
+          <w:rFonts w:ascii="Calibri" w:cs="Calibri" w:eastAsia="Calibri" w:hAnsi="Calibri"/>
+          <w:b/>
+          <w:bCs/>
+          <w:color w:val="064E3B"/>
+          <w:sz w:val="26"/>
+          <w:szCs w:val="26"/>
+        </w:rPr>
+        <w:t xml:space="preserve">”</w:t>
+      </w:r>
+    </w:p>
+    <w:p>
+      <w:pPr>
+        <w:pBdr>
+          <w:left w:val="single" w:color="059669" w:sz="18" w:space="12"/>
+        </w:pBdr>
+        <w:spacing w:after="60" w:before="60" w:line="320"/>
+        <w:ind w:left="360"/>
+      </w:pPr>
+      <w:r>
+        <w:rPr>
+          <w:color w:val="1B2B1B"/>
+        </w:rPr>
+        <w:t xml:space="preserve">  </w:t>
+      </w:r>
+      <w:r>
+        <w:rPr>
+          <w:rFonts w:ascii="Calibri" w:cs="Calibri" w:eastAsia="Calibri" w:hAnsi="Calibri"/>
+          <w:b/>
+          <w:bCs/>
+          <w:color w:val="064E3B"/>
+          <w:sz w:val="26"/>
+          <w:szCs w:val="26"/>
+        </w:rPr>
+        <w:t xml:space="preserve">“</w:t>
+      </w:r>
+      <w:r>
+        <w:rPr>
+          <w:rFonts w:ascii="Calibri" w:cs="Calibri" w:eastAsia="Calibri" w:hAnsi="Calibri"/>
+          <w:color w:val="1B2B1B"/>
+          <w:sz w:val="22"/>
+          <w:szCs w:val="22"/>
+        </w:rPr>
+        <w:t xml:space="preserve">Five UK cars off the road.</w:t>
+      </w:r>
+      <w:r>
+        <w:rPr>
+          <w:rFonts w:ascii="Calibri" w:cs="Calibri" w:eastAsia="Calibri" w:hAnsi="Calibri"/>
+          <w:b/>
+          <w:bCs/>
+          <w:color w:val="064E3B"/>
+          <w:sz w:val="26"/>
+          <w:szCs w:val="26"/>
+        </w:rPr>
+        <w:t xml:space="preserve">”</w:t>
+      </w:r>
+    </w:p>
+    <w:p>
+      <w:pPr>
+        <w:pBdr>
+          <w:left w:val="single" w:color="059669" w:sz="18" w:space="12"/>
+        </w:pBdr>
+        <w:spacing w:after="60" w:before="60" w:line="320"/>
+        <w:ind w:left="360"/>
+      </w:pPr>
+      <w:r>
+        <w:rPr>
+          <w:color w:val="1B2B1B"/>
+        </w:rPr>
+        <w:t xml:space="preserve">  </w:t>
+      </w:r>
+      <w:r>
+        <w:rPr>
+          <w:rFonts w:ascii="Calibri" w:cs="Calibri" w:eastAsia="Calibri" w:hAnsi="Calibri"/>
+          <w:b/>
+          <w:bCs/>
+          <w:color w:val="064E3B"/>
+          <w:sz w:val="26"/>
+          <w:szCs w:val="26"/>
+        </w:rPr>
+        <w:t xml:space="preserve">“</w:t>
+      </w:r>
+      <w:r>
+        <w:rPr>
+          <w:rFonts w:ascii="Calibri" w:cs="Calibri" w:eastAsia="Calibri" w:hAnsi="Calibri"/>
+          <w:color w:val="1B2B1B"/>
+          <w:sz w:val="22"/>
+          <w:szCs w:val="22"/>
+        </w:rPr>
+        <w:t xml:space="preserve">Same charge. Just better timing.</w:t>
+      </w:r>
+      <w:r>
+        <w:rPr>
+          <w:rFonts w:ascii="Calibri" w:cs="Calibri" w:eastAsia="Calibri" w:hAnsi="Calibri"/>
+          <w:b/>
+          <w:bCs/>
+          <w:color w:val="064E3B"/>
+          <w:sz w:val="26"/>
+          <w:szCs w:val="26"/>
+        </w:rPr>
+        <w:t xml:space="preserve">”</w:t>
+      </w:r>
+    </w:p>
+    <w:p>
+      <w:pPr>
+        <w:spacing w:after="80" w:before="160"/>
+      </w:pPr>
+      <w:r>
+        <w:rPr>
+          <w:rFonts w:ascii="Calibri" w:cs="Calibri" w:eastAsia="Calibri" w:hAnsi="Calibri"/>
+          <w:b/>
+          <w:bCs/>
+          <w:color w:val="1B2B1B"/>
+          <w:sz w:val="22"/>
+          <w:szCs w:val="22"/>
+        </w:rPr>
+        <w:t xml:space="preserve">Notes / if asked</w:t>
       </w:r>
     </w:p>
     <w:p>
@@ -1695,300 +2816,7 @@
           <w:sz w:val="22"/>
           <w:szCs w:val="22"/>
         </w:rPr>
-        <w:t xml:space="preserve">If asked about sources: order-of-magnitude estimates from published LLM-inference and image-gen energy papers — we make the assumption explicit in the UI.</w:t>
-      </w:r>
-    </w:p>
-    <w:p>
-      <w:pPr>
-        <w:pBdr>
-          <w:bottom w:val="single" w:color="E5E7EB" w:sz="8" w:space="1"/>
-        </w:pBdr>
-        <w:spacing w:after="240" w:before="240"/>
-      </w:pPr>
-      <w:r>
-        <w:t xml:space="preserve"/>
-      </w:r>
-    </w:p>
-    <w:p>
-      <w:pPr>
-        <w:pStyle w:val="Heading1"/>
-        <w:spacing w:after="200" w:before="300"/>
-      </w:pPr>
-      <w:r>
-        <w:rPr>
-          <w:rFonts w:ascii="Calibri" w:cs="Calibri" w:eastAsia="Calibri" w:hAnsi="Calibri"/>
-          <w:b/>
-          <w:bCs/>
-          <w:color w:val="064E3B"/>
-          <w:sz w:val="32"/>
-          <w:szCs w:val="32"/>
-        </w:rPr>
-        <w:t xml:space="preserve">Slide 7 — Guesstimate of positive environmental impact</w:t>
-      </w:r>
-    </w:p>
-    <w:p>
-      <w:pPr>
-        <w:spacing w:after="60" w:before="120"/>
-      </w:pPr>
-      <w:r>
-        <w:rPr>
-          <w:rFonts w:ascii="Calibri" w:cs="Calibri" w:eastAsia="Calibri" w:hAnsi="Calibri"/>
-          <w:b/>
-          <w:bCs/>
-          <w:color w:val="059669"/>
-          <w:spacing w:val="60"/>
-          <w:sz w:val="18"/>
-          <w:szCs w:val="18"/>
-        </w:rPr>
-        <w:t xml:space="preserve">IMPACT ESTIMATE (≈ 35 SECONDS)</w:t>
-      </w:r>
-    </w:p>
-    <w:p>
-      <w:pPr>
-        <w:spacing w:after="80" w:before="160"/>
-      </w:pPr>
-      <w:r>
-        <w:rPr>
-          <w:rFonts w:ascii="Calibri" w:cs="Calibri" w:eastAsia="Calibri" w:hAnsi="Calibri"/>
-          <w:b/>
-          <w:bCs/>
-          <w:color w:val="1B2B1B"/>
-          <w:sz w:val="22"/>
-          <w:szCs w:val="22"/>
-        </w:rPr>
-        <w:t xml:space="preserve">On screen</w:t>
-      </w:r>
-    </w:p>
-    <w:p>
-      <w:pPr>
-        <w:spacing w:after="60" w:before="60"/>
-      </w:pPr>
-      <w:r>
-        <w:rPr>
-          <w:rFonts w:ascii="Calibri" w:cs="Calibri" w:eastAsia="Calibri" w:hAnsi="Calibri"/>
-          <w:i/>
-          <w:iCs/>
-          <w:color w:val="475569"/>
-          <w:sz w:val="20"/>
-          <w:szCs w:val="20"/>
-        </w:rPr>
-        <w:t xml:space="preserve">Dark forest background · 3 rungs (1 student → 25k MMU → 1.5M UK uni students) · method footnote.</w:t>
-      </w:r>
-    </w:p>
-    <w:p>
-      <w:pPr>
-        <w:spacing w:after="80" w:before="160"/>
-      </w:pPr>
-      <w:r>
-        <w:rPr>
-          <w:rFonts w:ascii="Calibri" w:cs="Calibri" w:eastAsia="Calibri" w:hAnsi="Calibri"/>
-          <w:b/>
-          <w:bCs/>
-          <w:color w:val="1B2B1B"/>
-          <w:sz w:val="22"/>
-          <w:szCs w:val="22"/>
-        </w:rPr>
-        <w:t xml:space="preserve">Say</w:t>
-      </w:r>
-    </w:p>
-    <w:p>
-      <w:pPr>
-        <w:pBdr>
-          <w:left w:val="single" w:color="059669" w:sz="18" w:space="12"/>
-        </w:pBdr>
-        <w:spacing w:after="60" w:before="60" w:line="320"/>
-        <w:ind w:left="360"/>
-      </w:pPr>
-      <w:r>
-        <w:rPr>
-          <w:color w:val="1B2B1B"/>
-        </w:rPr>
-        <w:t xml:space="preserve">  </w:t>
-      </w:r>
-      <w:r>
-        <w:rPr>
-          <w:rFonts w:ascii="Calibri" w:cs="Calibri" w:eastAsia="Calibri" w:hAnsi="Calibri"/>
-          <w:b/>
-          <w:bCs/>
-          <w:color w:val="064E3B"/>
-          <w:sz w:val="26"/>
-          <w:szCs w:val="26"/>
-        </w:rPr>
-        <w:t xml:space="preserve">“</w:t>
-      </w:r>
-      <w:r>
-        <w:rPr>
-          <w:rFonts w:ascii="Calibri" w:cs="Calibri" w:eastAsia="Calibri" w:hAnsi="Calibri"/>
-          <w:color w:val="1B2B1B"/>
-          <w:sz w:val="22"/>
-          <w:szCs w:val="22"/>
-        </w:rPr>
-        <w:t xml:space="preserve">So what does this add up to? Here’s our honest estimate, scaled three ways.</w:t>
-      </w:r>
-      <w:r>
-        <w:rPr>
-          <w:rFonts w:ascii="Calibri" w:cs="Calibri" w:eastAsia="Calibri" w:hAnsi="Calibri"/>
-          <w:b/>
-          <w:bCs/>
-          <w:color w:val="064E3B"/>
-          <w:sz w:val="26"/>
-          <w:szCs w:val="26"/>
-        </w:rPr>
-        <w:t xml:space="preserve">”</w:t>
-      </w:r>
-    </w:p>
-    <w:p>
-      <w:pPr>
-        <w:pBdr>
-          <w:left w:val="single" w:color="059669" w:sz="18" w:space="12"/>
-        </w:pBdr>
-        <w:spacing w:after="60" w:before="60" w:line="320"/>
-        <w:ind w:left="360"/>
-      </w:pPr>
-      <w:r>
-        <w:rPr>
-          <w:color w:val="1B2B1B"/>
-        </w:rPr>
-        <w:t xml:space="preserve">  </w:t>
-      </w:r>
-      <w:r>
-        <w:rPr>
-          <w:rFonts w:ascii="Calibri" w:cs="Calibri" w:eastAsia="Calibri" w:hAnsi="Calibri"/>
-          <w:b/>
-          <w:bCs/>
-          <w:color w:val="064E3B"/>
-          <w:sz w:val="26"/>
-          <w:szCs w:val="26"/>
-        </w:rPr>
-        <w:t xml:space="preserve">“</w:t>
-      </w:r>
-      <w:r>
-        <w:rPr>
-          <w:rFonts w:ascii="Calibri" w:cs="Calibri" w:eastAsia="Calibri" w:hAnsi="Calibri"/>
-          <w:color w:val="1B2B1B"/>
-          <w:sz w:val="22"/>
-          <w:szCs w:val="22"/>
-        </w:rPr>
-        <w:t xml:space="preserve">For one student — you, one daily charge shifted to a greener window — about two hundred and fifty grams of CO₂ saved per year. Roughly a kilometre and a half of driving. Small.</w:t>
-      </w:r>
-      <w:r>
-        <w:rPr>
-          <w:rFonts w:ascii="Calibri" w:cs="Calibri" w:eastAsia="Calibri" w:hAnsi="Calibri"/>
-          <w:b/>
-          <w:bCs/>
-          <w:color w:val="064E3B"/>
-          <w:sz w:val="26"/>
-          <w:szCs w:val="26"/>
-        </w:rPr>
-        <w:t xml:space="preserve">”</w:t>
-      </w:r>
-    </w:p>
-    <w:p>
-      <w:pPr>
-        <w:pBdr>
-          <w:left w:val="single" w:color="059669" w:sz="18" w:space="12"/>
-        </w:pBdr>
-        <w:spacing w:after="60" w:before="60" w:line="320"/>
-        <w:ind w:left="360"/>
-      </w:pPr>
-      <w:r>
-        <w:rPr>
-          <w:color w:val="1B2B1B"/>
-        </w:rPr>
-        <w:t xml:space="preserve">  </w:t>
-      </w:r>
-      <w:r>
-        <w:rPr>
-          <w:rFonts w:ascii="Calibri" w:cs="Calibri" w:eastAsia="Calibri" w:hAnsi="Calibri"/>
-          <w:b/>
-          <w:bCs/>
-          <w:color w:val="064E3B"/>
-          <w:sz w:val="26"/>
-          <w:szCs w:val="26"/>
-        </w:rPr>
-        <w:t xml:space="preserve">“</w:t>
-      </w:r>
-      <w:r>
-        <w:rPr>
-          <w:rFonts w:ascii="Calibri" w:cs="Calibri" w:eastAsia="Calibri" w:hAnsi="Calibri"/>
-          <w:color w:val="1B2B1B"/>
-          <w:sz w:val="22"/>
-          <w:szCs w:val="22"/>
-        </w:rPr>
-        <w:t xml:space="preserve">For twenty-five thousand MMU students — collectively, four to eight tonnes a year. That’s three to five average UK cars off the road, for a year.</w:t>
-      </w:r>
-      <w:r>
-        <w:rPr>
-          <w:rFonts w:ascii="Calibri" w:cs="Calibri" w:eastAsia="Calibri" w:hAnsi="Calibri"/>
-          <w:b/>
-          <w:bCs/>
-          <w:color w:val="064E3B"/>
-          <w:sz w:val="26"/>
-          <w:szCs w:val="26"/>
-        </w:rPr>
-        <w:t xml:space="preserve">”</w:t>
-      </w:r>
-    </w:p>
-    <w:p>
-      <w:pPr>
-        <w:pBdr>
-          <w:left w:val="single" w:color="059669" w:sz="18" w:space="12"/>
-        </w:pBdr>
-        <w:spacing w:after="60" w:before="60" w:line="320"/>
-        <w:ind w:left="360"/>
-      </w:pPr>
-      <w:r>
-        <w:rPr>
-          <w:color w:val="1B2B1B"/>
-        </w:rPr>
-        <w:t xml:space="preserve">  </w:t>
-      </w:r>
-      <w:r>
-        <w:rPr>
-          <w:rFonts w:ascii="Calibri" w:cs="Calibri" w:eastAsia="Calibri" w:hAnsi="Calibri"/>
-          <w:b/>
-          <w:bCs/>
-          <w:color w:val="064E3B"/>
-          <w:sz w:val="26"/>
-          <w:szCs w:val="26"/>
-        </w:rPr>
-        <w:t xml:space="preserve">“</w:t>
-      </w:r>
-      <w:r>
-        <w:rPr>
-          <w:rFonts w:ascii="Calibri" w:cs="Calibri" w:eastAsia="Calibri" w:hAnsi="Calibri"/>
-          <w:color w:val="1B2B1B"/>
-          <w:sz w:val="22"/>
-          <w:szCs w:val="22"/>
-        </w:rPr>
-        <w:t xml:space="preserve">For the one and a half million UK university students — roughly two hundred and fifty tonnes a year. Same charge, same battery, same device. Only the timing changes.</w:t>
-      </w:r>
-      <w:r>
-        <w:rPr>
-          <w:rFonts w:ascii="Calibri" w:cs="Calibri" w:eastAsia="Calibri" w:hAnsi="Calibri"/>
-          <w:b/>
-          <w:bCs/>
-          <w:color w:val="064E3B"/>
-          <w:sz w:val="26"/>
-          <w:szCs w:val="26"/>
-        </w:rPr>
-        <w:t xml:space="preserve">”</w:t>
-      </w:r>
-    </w:p>
-    <w:p>
-      <w:pPr>
-        <w:spacing w:after="80" w:before="160"/>
-      </w:pPr>
-      <w:r>
-        <w:rPr>
-          <w:rFonts w:ascii="Calibri" w:cs="Calibri" w:eastAsia="Calibri" w:hAnsi="Calibri"/>
-          <w:b/>
-          <w:bCs/>
-          <w:color w:val="1B2B1B"/>
-          <w:sz w:val="22"/>
-          <w:szCs w:val="22"/>
-        </w:rPr>
-        <w:t xml:space="preserve">Notes / if asked</w:t>
+        <w:t xml:space="preserve">Slow on the middle rung. That’s the moment.</w:t>
       </w:r>
     </w:p>
     <w:p>
@@ -2007,7 +2835,484 @@
           <w:sz w:val="22"/>
           <w:szCs w:val="22"/>
         </w:rPr>
-        <w:t xml:space="preserve">Slow down here. The 25k MMU rung is the middle one and the moment.</w:t>
+        <w:t xml:space="preserve">If asked about method: ~0.7 g saved per charge, NW England grid, scaled linearly. Method footnote on the slide.</w:t>
+      </w:r>
+    </w:p>
+    <w:p>
+      <w:pPr>
+        <w:pBdr>
+          <w:bottom w:val="single" w:color="E5E7EB" w:sz="8" w:space="1"/>
+        </w:pBdr>
+        <w:spacing w:after="240" w:before="240"/>
+      </w:pPr>
+      <w:r>
+        <w:t xml:space="preserve"/>
+      </w:r>
+    </w:p>
+    <w:p>
+      <w:pPr>
+        <w:pStyle w:val="Heading1"/>
+        <w:spacing w:after="200" w:before="300"/>
+      </w:pPr>
+      <w:r>
+        <w:rPr>
+          <w:rFonts w:ascii="Calibri" w:cs="Calibri" w:eastAsia="Calibri" w:hAnsi="Calibri"/>
+          <w:b/>
+          <w:bCs/>
+          <w:color w:val="064E3B"/>
+          <w:sz w:val="32"/>
+          <w:szCs w:val="32"/>
+        </w:rPr>
+        <w:t xml:space="preserve">Slide 8 — Challenges and lessons</w:t>
+      </w:r>
+    </w:p>
+    <w:p>
+      <w:pPr>
+        <w:spacing w:after="60" w:before="120"/>
+      </w:pPr>
+      <w:r>
+        <w:rPr>
+          <w:rFonts w:ascii="Calibri" w:cs="Calibri" w:eastAsia="Calibri" w:hAnsi="Calibri"/>
+          <w:b/>
+          <w:bCs/>
+          <w:color w:val="059669"/>
+          <w:spacing w:val="60"/>
+          <w:sz w:val="18"/>
+          <w:szCs w:val="18"/>
+        </w:rPr>
+        <w:t xml:space="preserve">WHAT WE LEARNED (≈ 25 SECONDS)</w:t>
+      </w:r>
+    </w:p>
+    <w:p>
+      <w:pPr>
+        <w:spacing w:after="80" w:before="160"/>
+      </w:pPr>
+      <w:r>
+        <w:rPr>
+          <w:rFonts w:ascii="Calibri" w:cs="Calibri" w:eastAsia="Calibri" w:hAnsi="Calibri"/>
+          <w:b/>
+          <w:bCs/>
+          <w:color w:val="1B2B1B"/>
+          <w:sz w:val="22"/>
+          <w:szCs w:val="22"/>
+        </w:rPr>
+        <w:t xml:space="preserve">On screen</w:t>
+      </w:r>
+    </w:p>
+    <w:p>
+      <w:pPr>
+        <w:spacing w:after="60" w:before="60"/>
+      </w:pPr>
+      <w:r>
+        <w:rPr>
+          <w:rFonts w:ascii="Calibri" w:cs="Calibri" w:eastAsia="Calibri" w:hAnsi="Calibri"/>
+          <w:i/>
+          <w:iCs/>
+          <w:color w:val="475569"/>
+          <w:sz w:val="20"/>
+          <w:szCs w:val="20"/>
+        </w:rPr>
+        <w:t xml:space="preserve">Three columns · Challenges / Surprises / Lessons · three items each.</w:t>
+      </w:r>
+    </w:p>
+    <w:p>
+      <w:pPr>
+        <w:spacing w:after="80" w:before="160"/>
+      </w:pPr>
+      <w:r>
+        <w:rPr>
+          <w:rFonts w:ascii="Calibri" w:cs="Calibri" w:eastAsia="Calibri" w:hAnsi="Calibri"/>
+          <w:b/>
+          <w:bCs/>
+          <w:color w:val="1B2B1B"/>
+          <w:sz w:val="22"/>
+          <w:szCs w:val="22"/>
+        </w:rPr>
+        <w:t xml:space="preserve">Say</w:t>
+      </w:r>
+    </w:p>
+    <w:p>
+      <w:pPr>
+        <w:pBdr>
+          <w:left w:val="single" w:color="059669" w:sz="18" w:space="12"/>
+        </w:pBdr>
+        <w:spacing w:after="60" w:before="60" w:line="320"/>
+        <w:ind w:left="360"/>
+      </w:pPr>
+      <w:r>
+        <w:rPr>
+          <w:color w:val="1B2B1B"/>
+        </w:rPr>
+        <w:t xml:space="preserve">  </w:t>
+      </w:r>
+      <w:r>
+        <w:rPr>
+          <w:rFonts w:ascii="Calibri" w:cs="Calibri" w:eastAsia="Calibri" w:hAnsi="Calibri"/>
+          <w:b/>
+          <w:bCs/>
+          <w:color w:val="064E3B"/>
+          <w:sz w:val="26"/>
+          <w:szCs w:val="26"/>
+        </w:rPr>
+        <w:t xml:space="preserve">“</w:t>
+      </w:r>
+      <w:r>
+        <w:rPr>
+          <w:rFonts w:ascii="Calibri" w:cs="Calibri" w:eastAsia="Calibri" w:hAnsi="Calibri"/>
+          <w:color w:val="1B2B1B"/>
+          <w:sz w:val="22"/>
+          <w:szCs w:val="22"/>
+        </w:rPr>
+        <w:t xml:space="preserve">What was hard?</w:t>
+      </w:r>
+      <w:r>
+        <w:rPr>
+          <w:rFonts w:ascii="Calibri" w:cs="Calibri" w:eastAsia="Calibri" w:hAnsi="Calibri"/>
+          <w:b/>
+          <w:bCs/>
+          <w:color w:val="064E3B"/>
+          <w:sz w:val="26"/>
+          <w:szCs w:val="26"/>
+        </w:rPr>
+        <w:t xml:space="preserve">”</w:t>
+      </w:r>
+    </w:p>
+    <w:p>
+      <w:pPr>
+        <w:pBdr>
+          <w:left w:val="single" w:color="059669" w:sz="18" w:space="12"/>
+        </w:pBdr>
+        <w:spacing w:after="60" w:before="60" w:line="320"/>
+        <w:ind w:left="360"/>
+      </w:pPr>
+      <w:r>
+        <w:rPr>
+          <w:color w:val="1B2B1B"/>
+        </w:rPr>
+        <w:t xml:space="preserve">  </w:t>
+      </w:r>
+      <w:r>
+        <w:rPr>
+          <w:rFonts w:ascii="Calibri" w:cs="Calibri" w:eastAsia="Calibri" w:hAnsi="Calibri"/>
+          <w:b/>
+          <w:bCs/>
+          <w:color w:val="064E3B"/>
+          <w:sz w:val="26"/>
+          <w:szCs w:val="26"/>
+        </w:rPr>
+        <w:t xml:space="preserve">“</w:t>
+      </w:r>
+      <w:r>
+        <w:rPr>
+          <w:rFonts w:ascii="Calibri" w:cs="Calibri" w:eastAsia="Calibri" w:hAnsi="Calibri"/>
+          <w:color w:val="1B2B1B"/>
+          <w:sz w:val="22"/>
+          <w:szCs w:val="22"/>
+        </w:rPr>
+        <w:t xml:space="preserve">Modelling heat. No clean dataset. We used industry ranges and said so.</w:t>
+      </w:r>
+      <w:r>
+        <w:rPr>
+          <w:rFonts w:ascii="Calibri" w:cs="Calibri" w:eastAsia="Calibri" w:hAnsi="Calibri"/>
+          <w:b/>
+          <w:bCs/>
+          <w:color w:val="064E3B"/>
+          <w:sz w:val="26"/>
+          <w:szCs w:val="26"/>
+        </w:rPr>
+        <w:t xml:space="preserve">”</w:t>
+      </w:r>
+    </w:p>
+    <w:p>
+      <w:pPr>
+        <w:pBdr>
+          <w:left w:val="single" w:color="059669" w:sz="18" w:space="12"/>
+        </w:pBdr>
+        <w:spacing w:after="60" w:before="60" w:line="320"/>
+        <w:ind w:left="360"/>
+      </w:pPr>
+      <w:r>
+        <w:rPr>
+          <w:color w:val="1B2B1B"/>
+        </w:rPr>
+        <w:t xml:space="preserve">  </w:t>
+      </w:r>
+      <w:r>
+        <w:rPr>
+          <w:rFonts w:ascii="Calibri" w:cs="Calibri" w:eastAsia="Calibri" w:hAnsi="Calibri"/>
+          <w:b/>
+          <w:bCs/>
+          <w:color w:val="064E3B"/>
+          <w:sz w:val="26"/>
+          <w:szCs w:val="26"/>
+        </w:rPr>
+        <w:t xml:space="preserve">“</w:t>
+      </w:r>
+      <w:r>
+        <w:rPr>
+          <w:rFonts w:ascii="Calibri" w:cs="Calibri" w:eastAsia="Calibri" w:hAnsi="Calibri"/>
+          <w:color w:val="1B2B1B"/>
+          <w:sz w:val="22"/>
+          <w:szCs w:val="22"/>
+        </w:rPr>
+        <w:t xml:space="preserve">What surprised us?</w:t>
+      </w:r>
+      <w:r>
+        <w:rPr>
+          <w:rFonts w:ascii="Calibri" w:cs="Calibri" w:eastAsia="Calibri" w:hAnsi="Calibri"/>
+          <w:b/>
+          <w:bCs/>
+          <w:color w:val="064E3B"/>
+          <w:sz w:val="26"/>
+          <w:szCs w:val="26"/>
+        </w:rPr>
+        <w:t xml:space="preserve">”</w:t>
+      </w:r>
+    </w:p>
+    <w:p>
+      <w:pPr>
+        <w:pBdr>
+          <w:left w:val="single" w:color="059669" w:sz="18" w:space="12"/>
+        </w:pBdr>
+        <w:spacing w:after="60" w:before="60" w:line="320"/>
+        <w:ind w:left="360"/>
+      </w:pPr>
+      <w:r>
+        <w:rPr>
+          <w:color w:val="1B2B1B"/>
+        </w:rPr>
+        <w:t xml:space="preserve">  </w:t>
+      </w:r>
+      <w:r>
+        <w:rPr>
+          <w:rFonts w:ascii="Calibri" w:cs="Calibri" w:eastAsia="Calibri" w:hAnsi="Calibri"/>
+          <w:b/>
+          <w:bCs/>
+          <w:color w:val="064E3B"/>
+          <w:sz w:val="26"/>
+          <w:szCs w:val="26"/>
+        </w:rPr>
+        <w:t xml:space="preserve">“</w:t>
+      </w:r>
+      <w:r>
+        <w:rPr>
+          <w:rFonts w:ascii="Calibri" w:cs="Calibri" w:eastAsia="Calibri" w:hAnsi="Calibri"/>
+          <w:color w:val="1B2B1B"/>
+          <w:sz w:val="22"/>
+          <w:szCs w:val="22"/>
+        </w:rPr>
+        <w:t xml:space="preserve">For cloud AI, the cloud wins. Not the device.</w:t>
+      </w:r>
+      <w:r>
+        <w:rPr>
+          <w:rFonts w:ascii="Calibri" w:cs="Calibri" w:eastAsia="Calibri" w:hAnsi="Calibri"/>
+          <w:b/>
+          <w:bCs/>
+          <w:color w:val="064E3B"/>
+          <w:sz w:val="26"/>
+          <w:szCs w:val="26"/>
+        </w:rPr>
+        <w:t xml:space="preserve">”</w:t>
+      </w:r>
+    </w:p>
+    <w:p>
+      <w:pPr>
+        <w:pBdr>
+          <w:left w:val="single" w:color="059669" w:sz="18" w:space="12"/>
+        </w:pBdr>
+        <w:spacing w:after="60" w:before="60" w:line="320"/>
+        <w:ind w:left="360"/>
+      </w:pPr>
+      <w:r>
+        <w:rPr>
+          <w:color w:val="1B2B1B"/>
+        </w:rPr>
+        <w:t xml:space="preserve">  </w:t>
+      </w:r>
+      <w:r>
+        <w:rPr>
+          <w:rFonts w:ascii="Calibri" w:cs="Calibri" w:eastAsia="Calibri" w:hAnsi="Calibri"/>
+          <w:b/>
+          <w:bCs/>
+          <w:color w:val="064E3B"/>
+          <w:sz w:val="26"/>
+          <w:szCs w:val="26"/>
+        </w:rPr>
+        <w:t xml:space="preserve">“</w:t>
+      </w:r>
+      <w:r>
+        <w:rPr>
+          <w:rFonts w:ascii="Calibri" w:cs="Calibri" w:eastAsia="Calibri" w:hAnsi="Calibri"/>
+          <w:color w:val="1B2B1B"/>
+          <w:sz w:val="22"/>
+          <w:szCs w:val="22"/>
+        </w:rPr>
+        <w:t xml:space="preserve">Reframed everything.</w:t>
+      </w:r>
+      <w:r>
+        <w:rPr>
+          <w:rFonts w:ascii="Calibri" w:cs="Calibri" w:eastAsia="Calibri" w:hAnsi="Calibri"/>
+          <w:b/>
+          <w:bCs/>
+          <w:color w:val="064E3B"/>
+          <w:sz w:val="26"/>
+          <w:szCs w:val="26"/>
+        </w:rPr>
+        <w:t xml:space="preserve">”</w:t>
+      </w:r>
+    </w:p>
+    <w:p>
+      <w:pPr>
+        <w:pBdr>
+          <w:left w:val="single" w:color="059669" w:sz="18" w:space="12"/>
+        </w:pBdr>
+        <w:spacing w:after="60" w:before="60" w:line="320"/>
+        <w:ind w:left="360"/>
+      </w:pPr>
+      <w:r>
+        <w:rPr>
+          <w:color w:val="1B2B1B"/>
+        </w:rPr>
+        <w:t xml:space="preserve">  </w:t>
+      </w:r>
+      <w:r>
+        <w:rPr>
+          <w:rFonts w:ascii="Calibri" w:cs="Calibri" w:eastAsia="Calibri" w:hAnsi="Calibri"/>
+          <w:b/>
+          <w:bCs/>
+          <w:color w:val="064E3B"/>
+          <w:sz w:val="26"/>
+          <w:szCs w:val="26"/>
+        </w:rPr>
+        <w:t xml:space="preserve">“</w:t>
+      </w:r>
+      <w:r>
+        <w:rPr>
+          <w:rFonts w:ascii="Calibri" w:cs="Calibri" w:eastAsia="Calibri" w:hAnsi="Calibri"/>
+          <w:color w:val="1B2B1B"/>
+          <w:sz w:val="22"/>
+          <w:szCs w:val="22"/>
+        </w:rPr>
+        <w:t xml:space="preserve">And the biggest lesson?</w:t>
+      </w:r>
+      <w:r>
+        <w:rPr>
+          <w:rFonts w:ascii="Calibri" w:cs="Calibri" w:eastAsia="Calibri" w:hAnsi="Calibri"/>
+          <w:b/>
+          <w:bCs/>
+          <w:color w:val="064E3B"/>
+          <w:sz w:val="26"/>
+          <w:szCs w:val="26"/>
+        </w:rPr>
+        <w:t xml:space="preserve">”</w:t>
+      </w:r>
+    </w:p>
+    <w:p>
+      <w:pPr>
+        <w:pBdr>
+          <w:left w:val="single" w:color="059669" w:sz="18" w:space="12"/>
+        </w:pBdr>
+        <w:spacing w:after="60" w:before="60" w:line="320"/>
+        <w:ind w:left="360"/>
+      </w:pPr>
+      <w:r>
+        <w:rPr>
+          <w:color w:val="1B2B1B"/>
+        </w:rPr>
+        <w:t xml:space="preserve">  </w:t>
+      </w:r>
+      <w:r>
+        <w:rPr>
+          <w:rFonts w:ascii="Calibri" w:cs="Calibri" w:eastAsia="Calibri" w:hAnsi="Calibri"/>
+          <w:b/>
+          <w:bCs/>
+          <w:color w:val="064E3B"/>
+          <w:sz w:val="26"/>
+          <w:szCs w:val="26"/>
+        </w:rPr>
+        <w:t xml:space="preserve">“</w:t>
+      </w:r>
+      <w:r>
+        <w:rPr>
+          <w:rFonts w:ascii="Calibri" w:cs="Calibri" w:eastAsia="Calibri" w:hAnsi="Calibri"/>
+          <w:color w:val="1B2B1B"/>
+          <w:sz w:val="22"/>
+          <w:szCs w:val="22"/>
+        </w:rPr>
+        <w:t xml:space="preserve">Keep your phone a year longer.</w:t>
+      </w:r>
+      <w:r>
+        <w:rPr>
+          <w:rFonts w:ascii="Calibri" w:cs="Calibri" w:eastAsia="Calibri" w:hAnsi="Calibri"/>
+          <w:b/>
+          <w:bCs/>
+          <w:color w:val="064E3B"/>
+          <w:sz w:val="26"/>
+          <w:szCs w:val="26"/>
+        </w:rPr>
+        <w:t xml:space="preserve">”</w:t>
+      </w:r>
+    </w:p>
+    <w:p>
+      <w:pPr>
+        <w:pBdr>
+          <w:left w:val="single" w:color="059669" w:sz="18" w:space="12"/>
+        </w:pBdr>
+        <w:spacing w:after="60" w:before="60" w:line="320"/>
+        <w:ind w:left="360"/>
+      </w:pPr>
+      <w:r>
+        <w:rPr>
+          <w:color w:val="1B2B1B"/>
+        </w:rPr>
+        <w:t xml:space="preserve">  </w:t>
+      </w:r>
+      <w:r>
+        <w:rPr>
+          <w:rFonts w:ascii="Calibri" w:cs="Calibri" w:eastAsia="Calibri" w:hAnsi="Calibri"/>
+          <w:b/>
+          <w:bCs/>
+          <w:color w:val="064E3B"/>
+          <w:sz w:val="26"/>
+          <w:szCs w:val="26"/>
+        </w:rPr>
+        <w:t xml:space="preserve">“</w:t>
+      </w:r>
+      <w:r>
+        <w:rPr>
+          <w:rFonts w:ascii="Calibri" w:cs="Calibri" w:eastAsia="Calibri" w:hAnsi="Calibri"/>
+          <w:color w:val="1B2B1B"/>
+          <w:sz w:val="22"/>
+          <w:szCs w:val="22"/>
+        </w:rPr>
+        <w:t xml:space="preserve">That beats every green charge you’ll ever make.</w:t>
+      </w:r>
+      <w:r>
+        <w:rPr>
+          <w:rFonts w:ascii="Calibri" w:cs="Calibri" w:eastAsia="Calibri" w:hAnsi="Calibri"/>
+          <w:b/>
+          <w:bCs/>
+          <w:color w:val="064E3B"/>
+          <w:sz w:val="26"/>
+          <w:szCs w:val="26"/>
+        </w:rPr>
+        <w:t xml:space="preserve">”</w:t>
+      </w:r>
+    </w:p>
+    <w:p>
+      <w:pPr>
+        <w:spacing w:after="80" w:before="160"/>
+      </w:pPr>
+      <w:r>
+        <w:rPr>
+          <w:rFonts w:ascii="Calibri" w:cs="Calibri" w:eastAsia="Calibri" w:hAnsi="Calibri"/>
+          <w:b/>
+          <w:bCs/>
+          <w:color w:val="1B2B1B"/>
+          <w:sz w:val="22"/>
+          <w:szCs w:val="22"/>
+        </w:rPr>
+        <w:t xml:space="preserve">Notes / if asked</w:t>
       </w:r>
     </w:p>
     <w:p>
@@ -2026,7 +3331,7 @@
           <w:sz w:val="22"/>
           <w:szCs w:val="22"/>
         </w:rPr>
-        <w:t xml:space="preserve">Don’t over-claim the number. ‘Roughly’ and ‘the math says’ is fine. The method footnote is on the slide.</w:t>
+        <w:t xml:space="preserve">Pick one item per column — don’t read all nine.</w:t>
       </w:r>
     </w:p>
     <w:p>
@@ -2045,7 +3350,7 @@
           <w:sz w:val="22"/>
           <w:szCs w:val="22"/>
         </w:rPr>
-        <w:t xml:space="preserve">If asked about method: per-charge saving averaged at ~0.7 g CO₂ (iPhone-class, NW England grid, shifted to greenest 3h window). Scaled linearly to student counts.</w:t>
+        <w:t xml:space="preserve">If asked what’s next: PWA grid-low notification, Chrome extension, campus dashboard.</w:t>
       </w:r>
     </w:p>
     <w:p>
@@ -2073,7 +3378,7 @@
           <w:sz w:val="32"/>
           <w:szCs w:val="32"/>
         </w:rPr>
-        <w:t xml:space="preserve">Slide 8 — Challenges and lessons learned</w:t>
+        <w:t xml:space="preserve">Slide 9 — Try it · questions</w:t>
       </w:r>
     </w:p>
     <w:p>
@@ -2090,7 +3395,7 @@
           <w:sz w:val="18"/>
           <w:szCs w:val="18"/>
         </w:rPr>
-        <w:t xml:space="preserve">CHALLENGES &amp; LESSONS (≈ 40 SECONDS)</w:t>
+        <w:t xml:space="preserve">CLOSE (≈ 10 SECONDS)</w:t>
       </w:r>
     </w:p>
     <w:p>
@@ -2122,7 +3427,7 @@
           <w:sz w:val="20"/>
           <w:szCs w:val="20"/>
         </w:rPr>
-        <w:t xml:space="preserve">Three columns: Challenges (amber) · Surprises (blue) · Lessons (green). Three items each. Honest-scope footnote.</w:t>
+        <w:t xml:space="preserve">URL card · three feature bullets (10 devices · 6 activities · 48h forecast) · ‘Questions?’</w:t>
       </w:r>
     </w:p>
     <w:p>
@@ -2173,7 +3478,7 @@
           <w:sz w:val="22"/>
           <w:szCs w:val="22"/>
         </w:rPr>
-        <w:t xml:space="preserve">Quickly — what was hard, what surprised us, what we learned.</w:t>
+        <w:t xml:space="preserve">It’s running right now.</w:t>
       </w:r>
       <w:r>
         <w:rPr>
@@ -2219,7 +3524,7 @@
           <w:sz w:val="22"/>
           <w:szCs w:val="22"/>
         </w:rPr>
-        <w:t xml:space="preserve">The hardest part wasn’t the carbon data — the UK grid API is brilliant. It was modelling the ‘while-charging penalty.’ There’s no clean public dataset for it, so we used industry ranges and made the assumption explicit in the UI.</w:t>
+        <w:t xml:space="preserve">Localhost three thousand.</w:t>
       </w:r>
       <w:r>
         <w:rPr>
@@ -2265,7 +3570,7 @@
           <w:sz w:val="22"/>
           <w:szCs w:val="22"/>
         </w:rPr>
-        <w:t xml:space="preserve">The biggest surprise was that for cloud AI, the server side dominates over the device. We expected device choice to swing the answer; it didn’t for AI, but it does for video calls, gaming and browsing. We reframed the message rather than hiding the nuance.</w:t>
+        <w:t xml:space="preserve">Ten devices. Six activities. Live UK grid.</w:t>
       </w:r>
       <w:r>
         <w:rPr>
@@ -2311,219 +3616,7 @@
           <w:sz w:val="22"/>
           <w:szCs w:val="22"/>
         </w:rPr>
-        <w:t xml:space="preserve">And the biggest lesson — embodied beats operational. Manufacturing one iPhone is roughly two to three years of green charging. The most powerful behaviour change isn’t when you charge — it’s keeping the device a year longer. That’s on the slide too, honestly stated.</w:t>
-      </w:r>
-      <w:r>
-        <w:rPr>
-          <w:rFonts w:ascii="Calibri" w:cs="Calibri" w:eastAsia="Calibri" w:hAnsi="Calibri"/>
-          <w:b/>
-          <w:bCs/>
-          <w:color w:val="064E3B"/>
-          <w:sz w:val="26"/>
-          <w:szCs w:val="26"/>
-        </w:rPr>
-        <w:t xml:space="preserve">”</w:t>
-      </w:r>
-    </w:p>
-    <w:p>
-      <w:pPr>
-        <w:spacing w:after="80" w:before="160"/>
-      </w:pPr>
-      <w:r>
-        <w:rPr>
-          <w:rFonts w:ascii="Calibri" w:cs="Calibri" w:eastAsia="Calibri" w:hAnsi="Calibri"/>
-          <w:b/>
-          <w:bCs/>
-          <w:color w:val="1B2B1B"/>
-          <w:sz w:val="22"/>
-          <w:szCs w:val="22"/>
-        </w:rPr>
-        <w:t xml:space="preserve">Notes / if asked</w:t>
-      </w:r>
-    </w:p>
-    <w:p>
-      <w:pPr>
-        <w:pStyle w:val="ListParagraph"/>
-        <w:numPr>
-          <w:ilvl w:val="0"/>
-          <w:numId w:val="2"/>
-        </w:numPr>
-        <w:spacing w:after="40" w:before="40" w:line="300"/>
-      </w:pPr>
-      <w:r>
-        <w:rPr>
-          <w:rFonts w:ascii="Calibri" w:cs="Calibri" w:eastAsia="Calibri" w:hAnsi="Calibri"/>
-          <w:color w:val="1B2B1B"/>
-          <w:sz w:val="22"/>
-          <w:szCs w:val="22"/>
-        </w:rPr>
-        <w:t xml:space="preserve">Don’t read the cards top-to-bottom — pick one from each column.</w:t>
-      </w:r>
-    </w:p>
-    <w:p>
-      <w:pPr>
-        <w:pStyle w:val="ListParagraph"/>
-        <w:numPr>
-          <w:ilvl w:val="0"/>
-          <w:numId w:val="2"/>
-        </w:numPr>
-        <w:spacing w:after="40" w:before="40" w:line="300"/>
-      </w:pPr>
-      <w:r>
-        <w:rPr>
-          <w:rFonts w:ascii="Calibri" w:cs="Calibri" w:eastAsia="Calibri" w:hAnsi="Calibri"/>
-          <w:color w:val="1B2B1B"/>
-          <w:sz w:val="22"/>
-          <w:szCs w:val="22"/>
-        </w:rPr>
-        <w:t xml:space="preserve">If asked about the scope limitations: we model operational charging carbon only — no embodied device carbon, no networking. The Did-You-Know cards in the app surface those caveats.</w:t>
-      </w:r>
-    </w:p>
-    <w:p>
-      <w:pPr>
-        <w:pStyle w:val="ListParagraph"/>
-        <w:numPr>
-          <w:ilvl w:val="0"/>
-          <w:numId w:val="2"/>
-        </w:numPr>
-        <w:spacing w:after="40" w:before="40" w:line="300"/>
-      </w:pPr>
-      <w:r>
-        <w:rPr>
-          <w:rFonts w:ascii="Calibri" w:cs="Calibri" w:eastAsia="Calibri" w:hAnsi="Calibri"/>
-          <w:color w:val="1B2B1B"/>
-          <w:sz w:val="22"/>
-          <w:szCs w:val="22"/>
-        </w:rPr>
-        <w:t xml:space="preserve">If asked what you’d do next: PWA notification when the grid hits ‘very low’, a Chrome extension, or a campus dashboard.</w:t>
-      </w:r>
-    </w:p>
-    <w:p>
-      <w:pPr>
-        <w:pBdr>
-          <w:bottom w:val="single" w:color="E5E7EB" w:sz="8" w:space="1"/>
-        </w:pBdr>
-        <w:spacing w:after="240" w:before="240"/>
-      </w:pPr>
-      <w:r>
-        <w:t xml:space="preserve"/>
-      </w:r>
-    </w:p>
-    <w:p>
-      <w:pPr>
-        <w:pStyle w:val="Heading1"/>
-        <w:spacing w:after="200" w:before="300"/>
-      </w:pPr>
-      <w:r>
-        <w:rPr>
-          <w:rFonts w:ascii="Calibri" w:cs="Calibri" w:eastAsia="Calibri" w:hAnsi="Calibri"/>
-          <w:b/>
-          <w:bCs/>
-          <w:color w:val="064E3B"/>
-          <w:sz w:val="32"/>
-          <w:szCs w:val="32"/>
-        </w:rPr>
-        <w:t xml:space="preserve">Slide 9 — Try it · questions</w:t>
-      </w:r>
-    </w:p>
-    <w:p>
-      <w:pPr>
-        <w:spacing w:after="60" w:before="120"/>
-      </w:pPr>
-      <w:r>
-        <w:rPr>
-          <w:rFonts w:ascii="Calibri" w:cs="Calibri" w:eastAsia="Calibri" w:hAnsi="Calibri"/>
-          <w:b/>
-          <w:bCs/>
-          <w:color w:val="059669"/>
-          <w:spacing w:val="60"/>
-          <w:sz w:val="18"/>
-          <w:szCs w:val="18"/>
-        </w:rPr>
-        <w:t xml:space="preserve">CLOSE (≈ 15 SECONDS)</w:t>
-      </w:r>
-    </w:p>
-    <w:p>
-      <w:pPr>
-        <w:spacing w:after="80" w:before="160"/>
-      </w:pPr>
-      <w:r>
-        <w:rPr>
-          <w:rFonts w:ascii="Calibri" w:cs="Calibri" w:eastAsia="Calibri" w:hAnsi="Calibri"/>
-          <w:b/>
-          <w:bCs/>
-          <w:color w:val="1B2B1B"/>
-          <w:sz w:val="22"/>
-          <w:szCs w:val="22"/>
-        </w:rPr>
-        <w:t xml:space="preserve">On screen</w:t>
-      </w:r>
-    </w:p>
-    <w:p>
-      <w:pPr>
-        <w:spacing w:after="60" w:before="60"/>
-      </w:pPr>
-      <w:r>
-        <w:rPr>
-          <w:rFonts w:ascii="Calibri" w:cs="Calibri" w:eastAsia="Calibri" w:hAnsi="Calibri"/>
-          <w:i/>
-          <w:iCs/>
-          <w:color w:val="475569"/>
-          <w:sz w:val="20"/>
-          <w:szCs w:val="20"/>
-        </w:rPr>
-        <w:t xml:space="preserve">URL card · three feature bullets (10 devices · 6 activities · 48h forecast) · ‘Questions?’</w:t>
-      </w:r>
-    </w:p>
-    <w:p>
-      <w:pPr>
-        <w:spacing w:after="80" w:before="160"/>
-      </w:pPr>
-      <w:r>
-        <w:rPr>
-          <w:rFonts w:ascii="Calibri" w:cs="Calibri" w:eastAsia="Calibri" w:hAnsi="Calibri"/>
-          <w:b/>
-          <w:bCs/>
-          <w:color w:val="1B2B1B"/>
-          <w:sz w:val="22"/>
-          <w:szCs w:val="22"/>
-        </w:rPr>
-        <w:t xml:space="preserve">Say</w:t>
-      </w:r>
-    </w:p>
-    <w:p>
-      <w:pPr>
-        <w:pBdr>
-          <w:left w:val="single" w:color="059669" w:sz="18" w:space="12"/>
-        </w:pBdr>
-        <w:spacing w:after="60" w:before="60" w:line="320"/>
-        <w:ind w:left="360"/>
-      </w:pPr>
-      <w:r>
-        <w:rPr>
-          <w:color w:val="1B2B1B"/>
-        </w:rPr>
-        <w:t xml:space="preserve">  </w:t>
-      </w:r>
-      <w:r>
-        <w:rPr>
-          <w:rFonts w:ascii="Calibri" w:cs="Calibri" w:eastAsia="Calibri" w:hAnsi="Calibri"/>
-          <w:b/>
-          <w:bCs/>
-          <w:color w:val="064E3B"/>
-          <w:sz w:val="26"/>
-          <w:szCs w:val="26"/>
-        </w:rPr>
-        <w:t xml:space="preserve">“</w:t>
-      </w:r>
-      <w:r>
-        <w:rPr>
-          <w:rFonts w:ascii="Calibri" w:cs="Calibri" w:eastAsia="Calibri" w:hAnsi="Calibri"/>
-          <w:color w:val="1B2B1B"/>
-          <w:sz w:val="22"/>
-          <w:szCs w:val="22"/>
-        </w:rPr>
-        <w:t xml:space="preserve">It’s running right now at localhost three thousand. Ten devices, six activities, live UK grid carbon for any postcode. We’d love your questions.</w:t>
+        <w:t xml:space="preserve">Thanks. Questions?</w:t>
       </w:r>
       <w:r>
         <w:rPr>

</xml_diff>